<commit_message>
* Fix content in sample input docx file.
</commit_message>
<xml_diff>
--- a/samples/09-Tinhoc.docx
+++ b/samples/09-Tinhoc.docx
@@ -2874,6 +2874,14 @@
         <w:pStyle w:val="Heading2"/>
       </w:pPr>
       <w:r>
+        <w:t>Cài đặt hoặc gỡ bỏ hệ điều hành.</w:t>
+      </w:r>
+    </w:p>
+    <w:p>
+      <w:pPr>
+        <w:pStyle w:val="Heading2"/>
+      </w:pPr>
+      <w:r>
         <w:rPr>
           <w:rFonts w:eastAsia="Times New Roman"/>
         </w:rPr>
@@ -2890,14 +2898,6 @@
       </w:r>
       <w:r>
         <w:t>.</w:t>
-      </w:r>
-    </w:p>
-    <w:p>
-      <w:pPr>
-        <w:pStyle w:val="Heading2"/>
-      </w:pPr>
-      <w:r>
-        <w:t>Cài đặt hoặc gỡ bỏ hệ điều hành.</w:t>
       </w:r>
     </w:p>
     <w:p>

</xml_diff>

<commit_message>
+ Multiple true false independent section.
</commit_message>
<xml_diff>
--- a/samples/09-Tinhoc.docx
+++ b/samples/09-Tinhoc.docx
@@ -129,14 +129,21 @@
         </w:rPr>
         <w:t>PART</w:t>
       </w:r>
-    </w:p>
-    <w:p>
-      <w:r>
-        <w:rPr>
-          <w:rFonts w:eastAsia="Times New Roman"/>
+      <w:r>
+        <w:rPr>
           <w:b/>
           <w:bCs/>
         </w:rPr>
+        <w:t xml:space="preserve"> 1</w:t>
+      </w:r>
+    </w:p>
+    <w:p>
+      <w:r>
+        <w:rPr>
+          <w:rFonts w:eastAsia="Times New Roman"/>
+          <w:b/>
+          <w:bCs/>
+        </w:rPr>
         <w:t>PHẦN I.</w:t>
       </w:r>
       <w:r>
@@ -199,7 +206,13 @@
         <w:rPr>
           <w:rFonts w:eastAsia="Times New Roman"/>
         </w:rPr>
-        <w:t xml:space="preserve">không là đặc </w:t>
+        <w:t>không</w:t>
+      </w:r>
+      <w:r>
+        <w:rPr>
+          <w:rFonts w:eastAsia="Times New Roman"/>
+        </w:rPr>
+        <w:t xml:space="preserve"> là đặc </w:t>
       </w:r>
       <w:r>
         <w:t>trưng của AI</w:t>
@@ -2242,51 +2255,83 @@
       <w:r>
         <w:rPr>
           <w:rFonts w:eastAsia="Times New Roman"/>
+          <w:i/>
+          <w:iCs/>
         </w:rPr>
         <w:t xml:space="preserve">Phương </w:t>
       </w:r>
       <w:r>
+        <w:rPr>
+          <w:i/>
+          <w:iCs/>
+        </w:rPr>
         <w:t xml:space="preserve">án nào </w:t>
       </w:r>
       <w:r>
         <w:rPr>
           <w:rFonts w:eastAsia="Times New Roman"/>
+          <w:i/>
+          <w:iCs/>
         </w:rPr>
         <w:t xml:space="preserve">cho bên dưới mô </w:t>
       </w:r>
       <w:r>
+        <w:rPr>
+          <w:i/>
+          <w:iCs/>
+        </w:rPr>
         <w:t xml:space="preserve">tả đúng định dạng của </w:t>
       </w:r>
       <w:r>
         <w:rPr>
           <w:rFonts w:eastAsia="Times New Roman"/>
+          <w:i/>
+          <w:iCs/>
         </w:rPr>
         <w:t xml:space="preserve">văn </w:t>
       </w:r>
       <w:r>
+        <w:rPr>
+          <w:i/>
+          <w:iCs/>
+        </w:rPr>
         <w:t xml:space="preserve">bản </w:t>
       </w:r>
       <w:r>
         <w:rPr>
           <w:rFonts w:eastAsia="Times New Roman"/>
+          <w:i/>
+          <w:iCs/>
         </w:rPr>
         <w:t xml:space="preserve">được </w:t>
       </w:r>
       <w:r>
+        <w:rPr>
+          <w:i/>
+          <w:iCs/>
+        </w:rPr>
         <w:t xml:space="preserve">hiển thị khi </w:t>
       </w:r>
       <w:r>
         <w:rPr>
           <w:rFonts w:eastAsia="Times New Roman"/>
+          <w:i/>
+          <w:iCs/>
         </w:rPr>
         <w:t xml:space="preserve">thực hiện </w:t>
       </w:r>
       <w:r>
+        <w:rPr>
+          <w:i/>
+          <w:iCs/>
+        </w:rPr>
         <w:t>đoạn mã HTML sau</w:t>
       </w:r>
       <w:r>
         <w:rPr>
           <w:rFonts w:eastAsia="Times New Roman"/>
+          <w:i/>
+          <w:iCs/>
         </w:rPr>
         <w:t>?</w:t>
       </w:r>
@@ -2385,6 +2430,24 @@
     </w:p>
     <w:p>
       <w:r>
+        <w:t>----</w:t>
+      </w:r>
+      <w:r>
+        <w:t>--------</w:t>
+      </w:r>
+    </w:p>
+    <w:p>
+      <w:pPr>
+        <w:rPr>
+          <w:i/>
+          <w:iCs/>
+        </w:rPr>
+      </w:pPr>
+      <w:r>
+        <w:rPr>
+          <w:i/>
+          <w:iCs/>
+        </w:rPr>
         <w:t>Đoạn chương trình viết bằng ngôn ngữ Python</w:t>
       </w:r>
     </w:p>
@@ -2413,11 +2476,6 @@
       </w:r>
     </w:p>
     <w:p>
-      <w:pPr>
-        <w:rPr>
-          <w:rFonts w:eastAsia="Times New Roman"/>
-        </w:rPr>
-      </w:pPr>
       <w:r>
         <w:t>print(S)</w:t>
       </w:r>
@@ -2429,29 +2487,60 @@
         </w:rPr>
       </w:pPr>
       <w:r>
+        <w:t>------------</w:t>
+      </w:r>
+    </w:p>
+    <w:p>
+      <w:pPr>
+        <w:rPr>
+          <w:rFonts w:eastAsia="Times New Roman"/>
+          <w:i/>
+          <w:iCs/>
+        </w:rPr>
+      </w:pPr>
+      <w:r>
+        <w:rPr>
+          <w:i/>
+          <w:iCs/>
+        </w:rPr>
+        <w:lastRenderedPageBreak/>
         <w:t xml:space="preserve">Đoạn chương </w:t>
       </w:r>
       <w:r>
         <w:rPr>
           <w:rFonts w:eastAsia="Times New Roman"/>
+          <w:i/>
+          <w:iCs/>
         </w:rPr>
         <w:t xml:space="preserve">trình viết </w:t>
       </w:r>
       <w:r>
+        <w:rPr>
+          <w:i/>
+          <w:iCs/>
+        </w:rPr>
         <w:t xml:space="preserve">bằng </w:t>
       </w:r>
       <w:r>
         <w:rPr>
           <w:rFonts w:eastAsia="Times New Roman"/>
+          <w:i/>
+          <w:iCs/>
         </w:rPr>
         <w:t xml:space="preserve">ngôn </w:t>
       </w:r>
       <w:r>
+        <w:rPr>
+          <w:i/>
+          <w:iCs/>
+        </w:rPr>
         <w:t xml:space="preserve">ngữ </w:t>
       </w:r>
       <w:r>
         <w:rPr>
           <w:rFonts w:eastAsia="Times New Roman"/>
+          <w:i/>
+          <w:iCs/>
         </w:rPr>
         <w:t>C++</w:t>
       </w:r>
@@ -2468,92 +2557,475 @@
         </w:rPr>
       </w:pPr>
       <w:r>
+        <w:t xml:space="preserve">for (int i = 1; i &lt; </w:t>
+      </w:r>
+      <w:r>
+        <w:rPr>
+          <w:rFonts w:eastAsia="Times New Roman"/>
+        </w:rPr>
+        <w:t>4</w:t>
+      </w:r>
+      <w:r>
+        <w:t>; i++</w:t>
+      </w:r>
+      <w:r>
+        <w:rPr>
+          <w:rFonts w:eastAsia="Times New Roman"/>
+        </w:rPr>
+        <w:t>)</w:t>
+      </w:r>
+    </w:p>
+    <w:p>
+      <w:r>
+        <w:t>S += i*i;</w:t>
+      </w:r>
+    </w:p>
+    <w:p>
+      <w:r>
+        <w:t>cout &lt;&lt; S;</w:t>
+      </w:r>
+    </w:p>
+    <w:p>
+      <w:r>
+        <w:t>------------</w:t>
+      </w:r>
+    </w:p>
+    <w:p>
+      <w:r>
+        <w:t>Phương án nào dưới đây nêu đúng giá trị của S sau khi thực hiện đoạn chương trình trên?</w:t>
+      </w:r>
+      <w:r>
+        <w:t>}</w:t>
+      </w:r>
+    </w:p>
+    <w:p>
+      <w:pPr>
+        <w:pStyle w:val="Heading2"/>
+      </w:pPr>
+      <w:r>
+        <w:t>30.</w:t>
+      </w:r>
+    </w:p>
+    <w:p>
+      <w:pPr>
+        <w:pStyle w:val="Heading2"/>
+        <w:rPr>
+          <w:rFonts w:eastAsia="Times New Roman"/>
+        </w:rPr>
+      </w:pPr>
+      <w:r>
+        <w:rPr>
+          <w:rFonts w:eastAsia="Times New Roman"/>
+        </w:rPr>
+        <w:t>29</w:t>
+      </w:r>
+    </w:p>
+    <w:p>
+      <w:pPr>
+        <w:pStyle w:val="Heading2"/>
+      </w:pPr>
+      <w:r>
+        <w:t>14</w:t>
+      </w:r>
+    </w:p>
+    <w:p>
+      <w:pPr>
+        <w:pStyle w:val="Heading2"/>
+      </w:pPr>
+      <w:r>
+        <w:t>13.</w:t>
+      </w:r>
+    </w:p>
+    <w:p>
+      <w:pPr>
+        <w:rPr>
+          <w:rFonts w:eastAsia="Times New Roman"/>
+        </w:rPr>
+      </w:pPr>
+      <w:r>
+        <w:t>Đáp án:</w:t>
+      </w:r>
+      <w:r>
+        <w:t xml:space="preserve"> C</w:t>
+      </w:r>
+    </w:p>
+    <w:p>
+      <w:pPr>
+        <w:pStyle w:val="Heading1"/>
+      </w:pPr>
+      <w:r>
+        <w:t>Hành vi nào sau đây thể hiện tính nhân văn trong giao tiếp trên không gian mạng?</w:t>
+      </w:r>
+    </w:p>
+    <w:p>
+      <w:pPr>
+        <w:pStyle w:val="Heading2"/>
+      </w:pPr>
+      <w:r>
+        <w:t xml:space="preserve">Sử dụng ngôn từ một </w:t>
+      </w:r>
+      <w:r>
+        <w:rPr>
+          <w:rFonts w:eastAsia="Times New Roman"/>
+        </w:rPr>
+        <w:t xml:space="preserve">cách </w:t>
+      </w:r>
+      <w:r>
+        <w:t>tùy thích khi tham gia bình luận trực tuyến.</w:t>
+      </w:r>
+    </w:p>
+    <w:p>
+      <w:pPr>
+        <w:pStyle w:val="Heading2"/>
+      </w:pPr>
+      <w:r>
+        <w:t>Tôn trọng quyền riêng tư của người khác khi chia sẻ thông tin cá nhân.</w:t>
+      </w:r>
+    </w:p>
+    <w:p>
+      <w:pPr>
+        <w:pStyle w:val="Heading2"/>
+      </w:pPr>
+      <w:r>
+        <w:t>Chia sẻ thông tin chưa được kiểm chứng để nhằm thu hút lượt tương tác.</w:t>
+      </w:r>
+    </w:p>
+    <w:p>
+      <w:pPr>
+        <w:pStyle w:val="Heading2"/>
+      </w:pPr>
+      <w:r>
+        <w:t xml:space="preserve">Sử dụng không gian mạng </w:t>
+      </w:r>
+      <w:r>
+        <w:rPr>
+          <w:rFonts w:eastAsia="Times New Roman"/>
+        </w:rPr>
+        <w:t xml:space="preserve">để </w:t>
+      </w:r>
+      <w:r>
+        <w:t xml:space="preserve">chỉ </w:t>
+      </w:r>
+      <w:r>
+        <w:rPr>
+          <w:rFonts w:eastAsia="Times New Roman"/>
+        </w:rPr>
+        <w:t xml:space="preserve">trích người </w:t>
+      </w:r>
+      <w:r>
+        <w:t xml:space="preserve">khác một cách </w:t>
+      </w:r>
+      <w:r>
+        <w:rPr>
+          <w:rFonts w:eastAsia="Times New Roman"/>
+        </w:rPr>
+        <w:t xml:space="preserve">gay </w:t>
+      </w:r>
+      <w:r>
+        <w:t>gắt.</w:t>
+      </w:r>
+    </w:p>
+    <w:p>
+      <w:r>
+        <w:t>Đáp án:</w:t>
+      </w:r>
+      <w:r>
+        <w:t xml:space="preserve"> B</w:t>
+      </w:r>
+    </w:p>
+    <w:p>
+      <w:pPr>
+        <w:pStyle w:val="Heading1"/>
+        <w:rPr>
+          <w:rFonts w:eastAsia="Times New Roman"/>
+        </w:rPr>
+      </w:pPr>
+      <w:r>
+        <w:t xml:space="preserve">Hành vi nào sau đây </w:t>
+      </w:r>
+      <w:r>
+        <w:rPr>
+          <w:rFonts w:eastAsia="Times New Roman"/>
+        </w:rPr>
+        <w:t xml:space="preserve">bị xem là vi </w:t>
+      </w:r>
+      <w:r>
+        <w:t xml:space="preserve">phạm </w:t>
+      </w:r>
+      <w:r>
+        <w:rPr>
+          <w:rFonts w:eastAsia="Times New Roman"/>
+        </w:rPr>
+        <w:t xml:space="preserve">pháp </w:t>
+      </w:r>
+      <w:r>
+        <w:t xml:space="preserve">luật </w:t>
+      </w:r>
+      <w:r>
+        <w:rPr>
+          <w:rFonts w:eastAsia="Times New Roman"/>
+        </w:rPr>
+        <w:t xml:space="preserve">trên không </w:t>
+      </w:r>
+      <w:r>
+        <w:t>gian mạng</w:t>
+      </w:r>
+      <w:r>
+        <w:rPr>
+          <w:rFonts w:eastAsia="Times New Roman"/>
+        </w:rPr>
+        <w:t>?</w:t>
+      </w:r>
+    </w:p>
+    <w:p>
+      <w:pPr>
+        <w:pStyle w:val="Heading2"/>
+      </w:pPr>
+      <w:r>
+        <w:rPr>
+          <w:rFonts w:eastAsia="Times New Roman"/>
+        </w:rPr>
+        <w:t xml:space="preserve">Làm </w:t>
+      </w:r>
+      <w:r>
+        <w:t xml:space="preserve">tắc nghẽn hệ thống </w:t>
+      </w:r>
+      <w:r>
+        <w:rPr>
+          <w:rFonts w:eastAsia="Times New Roman"/>
+        </w:rPr>
+        <w:t xml:space="preserve">mạng </w:t>
+      </w:r>
+      <w:r>
+        <w:t>của nhà trường.</w:t>
+      </w:r>
+    </w:p>
+    <w:p>
+      <w:pPr>
+        <w:pStyle w:val="Heading2"/>
+      </w:pPr>
+      <w:r>
+        <w:t>Không trả lời tin nhắn ngay lập tức.</w:t>
+      </w:r>
+    </w:p>
+    <w:p>
+      <w:pPr>
+        <w:pStyle w:val="Heading2"/>
+      </w:pPr>
+      <w:r>
+        <w:t xml:space="preserve">Tải phần </w:t>
+      </w:r>
+      <w:r>
+        <w:rPr>
+          <w:rFonts w:eastAsia="Times New Roman"/>
+        </w:rPr>
+        <w:t xml:space="preserve">mềm </w:t>
+      </w:r>
+      <w:r>
+        <w:t xml:space="preserve">nguồn </w:t>
+      </w:r>
+      <w:r>
+        <w:rPr>
+          <w:rFonts w:eastAsia="Times New Roman"/>
+        </w:rPr>
+        <w:t xml:space="preserve">mở để </w:t>
+      </w:r>
+      <w:r>
+        <w:t>sử dụng.</w:t>
+      </w:r>
+    </w:p>
+    <w:p>
+      <w:pPr>
+        <w:pStyle w:val="Heading2"/>
+      </w:pPr>
+      <w:r>
+        <w:t>Gửi email cho bạn bè mà không ghi tiêu đề.</w:t>
+      </w:r>
+    </w:p>
+    <w:p>
+      <w:r>
+        <w:t>Đáp án:</w:t>
+      </w:r>
+      <w:r>
+        <w:t xml:space="preserve"> A</w:t>
+      </w:r>
+    </w:p>
+    <w:p>
+      <w:pPr>
+        <w:pStyle w:val="Heading1"/>
+      </w:pPr>
+      <w:r>
+        <w:t>Việc tự ý đăng tải hình ảnh của người khác lên mạng xã hội vi phạm quyền về vấn đề nào dưới đây?</w:t>
+      </w:r>
+    </w:p>
+    <w:p>
+      <w:pPr>
+        <w:pStyle w:val="Heading2"/>
+      </w:pPr>
+      <w:r>
+        <w:rPr>
+          <w:rFonts w:eastAsia="Times New Roman"/>
+        </w:rPr>
+        <w:t xml:space="preserve">Tự do </w:t>
+      </w:r>
+      <w:r>
+        <w:t>ngôn luận.</w:t>
+      </w:r>
+    </w:p>
+    <w:p>
+      <w:pPr>
+        <w:pStyle w:val="Heading2"/>
+      </w:pPr>
+      <w:r>
+        <w:t xml:space="preserve">Bảo mật thông tin </w:t>
+      </w:r>
+      <w:r>
+        <w:rPr>
+          <w:rFonts w:eastAsia="Times New Roman"/>
+        </w:rPr>
+        <w:t>cá nhân</w:t>
+      </w:r>
+      <w:r>
+        <w:t>.</w:t>
+      </w:r>
+    </w:p>
+    <w:p>
+      <w:pPr>
+        <w:pStyle w:val="Heading2"/>
+      </w:pPr>
+      <w:r>
+        <w:t>Sử dụng hình ảnh công khai.</w:t>
+      </w:r>
+    </w:p>
+    <w:p>
+      <w:pPr>
+        <w:pStyle w:val="Heading2"/>
+      </w:pPr>
+      <w:r>
+        <w:t>Phản hồi của người tiêu dùng.</w:t>
+      </w:r>
+    </w:p>
+    <w:p>
+      <w:r>
+        <w:t>Đáp án:</w:t>
+      </w:r>
+      <w:r>
+        <w:t xml:space="preserve"> B</w:t>
+      </w:r>
+    </w:p>
+    <w:p>
+      <w:pPr>
+        <w:pStyle w:val="Heading1"/>
+        <w:rPr>
+          <w:rFonts w:eastAsia="Times New Roman"/>
+        </w:rPr>
+      </w:pPr>
+      <w:r>
+        <w:rPr>
+          <w:rFonts w:eastAsia="Times New Roman"/>
+        </w:rPr>
+        <w:t xml:space="preserve">Công việc </w:t>
+      </w:r>
+      <w:r>
+        <w:t xml:space="preserve">nào </w:t>
+      </w:r>
+      <w:r>
+        <w:rPr>
+          <w:rFonts w:eastAsia="Times New Roman"/>
+        </w:rPr>
+        <w:t xml:space="preserve">dưới đây </w:t>
+      </w:r>
+      <w:r>
+        <w:t xml:space="preserve">thuộc nhóm nghề sửa chữa và bảo trì máy </w:t>
+      </w:r>
+      <w:r>
+        <w:rPr>
+          <w:rFonts w:eastAsia="Times New Roman"/>
+        </w:rPr>
+        <w:t>tính?</w:t>
+      </w:r>
+    </w:p>
+    <w:p>
+      <w:pPr>
+        <w:pStyle w:val="Heading2"/>
+      </w:pPr>
+      <w:r>
+        <w:t xml:space="preserve">Thiết kế và xây </w:t>
+      </w:r>
+      <w:r>
+        <w:rPr>
+          <w:rFonts w:eastAsia="Times New Roman"/>
+        </w:rPr>
+        <w:t xml:space="preserve">dựng </w:t>
+      </w:r>
+      <w:r>
+        <w:t>hệ điều hành.</w:t>
+      </w:r>
+    </w:p>
+    <w:p>
+      <w:pPr>
+        <w:pStyle w:val="Heading2"/>
+      </w:pPr>
+      <w:r>
+        <w:t>Cài đặt hoặc gỡ bỏ hệ điều hành.</w:t>
+      </w:r>
+    </w:p>
+    <w:p>
+      <w:pPr>
+        <w:pStyle w:val="Heading2"/>
+      </w:pPr>
+      <w:r>
+        <w:rPr>
+          <w:rFonts w:eastAsia="Times New Roman"/>
+        </w:rPr>
         <w:lastRenderedPageBreak/>
-        <w:t xml:space="preserve">for (int i = 1; i &lt; </w:t>
-      </w:r>
-      <w:r>
-        <w:rPr>
-          <w:rFonts w:eastAsia="Times New Roman"/>
-        </w:rPr>
-        <w:t>4</w:t>
-      </w:r>
-      <w:r>
-        <w:t>; i++</w:t>
-      </w:r>
-      <w:r>
-        <w:rPr>
-          <w:rFonts w:eastAsia="Times New Roman"/>
-        </w:rPr>
-        <w:t>)</w:t>
-      </w:r>
-    </w:p>
-    <w:p>
-      <w:r>
-        <w:t>S += i*i;</w:t>
-      </w:r>
-    </w:p>
-    <w:p>
-      <w:r>
-        <w:t>cout &lt;&lt; S;</w:t>
-      </w:r>
-    </w:p>
-    <w:p>
-      <w:r>
-        <w:t>Phương án nào dưới đây nêu đúng giá trị của S sau khi thực hiện đoạn chương trình trên?</w:t>
-      </w:r>
-      <w:r>
-        <w:t>}</w:t>
-      </w:r>
-    </w:p>
-    <w:p>
-      <w:pPr>
-        <w:pStyle w:val="Heading2"/>
-      </w:pPr>
-      <w:r>
-        <w:t>30.</w:t>
-      </w:r>
-    </w:p>
-    <w:p>
-      <w:pPr>
-        <w:pStyle w:val="Heading2"/>
-        <w:rPr>
-          <w:rFonts w:eastAsia="Times New Roman"/>
-        </w:rPr>
-      </w:pPr>
-      <w:r>
-        <w:rPr>
-          <w:rFonts w:eastAsia="Times New Roman"/>
-        </w:rPr>
-        <w:t>29</w:t>
-      </w:r>
-    </w:p>
-    <w:p>
-      <w:pPr>
-        <w:pStyle w:val="Heading2"/>
-      </w:pPr>
-      <w:r>
-        <w:t>14</w:t>
-      </w:r>
-    </w:p>
-    <w:p>
-      <w:pPr>
-        <w:pStyle w:val="Heading2"/>
-      </w:pPr>
-      <w:r>
-        <w:t>13.</w:t>
-      </w:r>
-    </w:p>
-    <w:p>
-      <w:pPr>
-        <w:rPr>
-          <w:rFonts w:eastAsia="Times New Roman"/>
-        </w:rPr>
-      </w:pPr>
+        <w:t xml:space="preserve">Phát </w:t>
+      </w:r>
+      <w:r>
+        <w:t xml:space="preserve">triển phần mềm di </w:t>
+      </w:r>
+      <w:r>
+        <w:rPr>
+          <w:rFonts w:eastAsia="Times New Roman"/>
+        </w:rPr>
+        <w:t>động</w:t>
+      </w:r>
+      <w:r>
+        <w:t>.</w:t>
+      </w:r>
+    </w:p>
+    <w:p>
+      <w:pPr>
+        <w:pStyle w:val="Heading2"/>
+      </w:pPr>
+      <w:r>
+        <w:t xml:space="preserve">Xây dựng </w:t>
+      </w:r>
+      <w:r>
+        <w:rPr>
+          <w:rFonts w:eastAsia="Times New Roman"/>
+        </w:rPr>
+        <w:t xml:space="preserve">các </w:t>
+      </w:r>
+      <w:r>
+        <w:t xml:space="preserve">ứng dụng </w:t>
+      </w:r>
+      <w:r>
+        <w:rPr>
+          <w:rFonts w:eastAsia="Times New Roman"/>
+        </w:rPr>
+        <w:t>mạng</w:t>
+      </w:r>
+      <w:r>
+        <w:t>.</w:t>
+      </w:r>
+    </w:p>
+    <w:p>
       <w:r>
         <w:t>Đáp án:</w:t>
       </w:r>
       <w:r>
-        <w:t xml:space="preserve"> C</w:t>
+        <w:t xml:space="preserve"> B</w:t>
       </w:r>
     </w:p>
     <w:p>
@@ -2561,385 +3033,6 @@
         <w:pStyle w:val="Heading1"/>
       </w:pPr>
       <w:r>
-        <w:t>Hành vi nào sau đây thể hiện tính nhân văn trong giao tiếp trên không gian mạng?</w:t>
-      </w:r>
-    </w:p>
-    <w:p>
-      <w:pPr>
-        <w:pStyle w:val="Heading2"/>
-      </w:pPr>
-      <w:r>
-        <w:t xml:space="preserve">Sử dụng ngôn từ một </w:t>
-      </w:r>
-      <w:r>
-        <w:rPr>
-          <w:rFonts w:eastAsia="Times New Roman"/>
-        </w:rPr>
-        <w:t xml:space="preserve">cách </w:t>
-      </w:r>
-      <w:r>
-        <w:t>tùy thích khi tham gia bình luận trực tuyến.</w:t>
-      </w:r>
-    </w:p>
-    <w:p>
-      <w:pPr>
-        <w:pStyle w:val="Heading2"/>
-      </w:pPr>
-      <w:r>
-        <w:t>Tôn trọng quyền riêng tư của người khác khi chia sẻ thông tin cá nhân.</w:t>
-      </w:r>
-    </w:p>
-    <w:p>
-      <w:pPr>
-        <w:pStyle w:val="Heading2"/>
-      </w:pPr>
-      <w:r>
-        <w:t>Chia sẻ thông tin chưa được kiểm chứng để nhằm thu hút lượt tương tác.</w:t>
-      </w:r>
-    </w:p>
-    <w:p>
-      <w:pPr>
-        <w:pStyle w:val="Heading2"/>
-      </w:pPr>
-      <w:r>
-        <w:t xml:space="preserve">Sử dụng không gian mạng </w:t>
-      </w:r>
-      <w:r>
-        <w:rPr>
-          <w:rFonts w:eastAsia="Times New Roman"/>
-        </w:rPr>
-        <w:t xml:space="preserve">để </w:t>
-      </w:r>
-      <w:r>
-        <w:t xml:space="preserve">chỉ </w:t>
-      </w:r>
-      <w:r>
-        <w:rPr>
-          <w:rFonts w:eastAsia="Times New Roman"/>
-        </w:rPr>
-        <w:t xml:space="preserve">trích người </w:t>
-      </w:r>
-      <w:r>
-        <w:t xml:space="preserve">khác một cách </w:t>
-      </w:r>
-      <w:r>
-        <w:rPr>
-          <w:rFonts w:eastAsia="Times New Roman"/>
-        </w:rPr>
-        <w:t xml:space="preserve">gay </w:t>
-      </w:r>
-      <w:r>
-        <w:t>gắt.</w:t>
-      </w:r>
-    </w:p>
-    <w:p>
-      <w:r>
-        <w:t>Đáp án:</w:t>
-      </w:r>
-      <w:r>
-        <w:t xml:space="preserve"> B</w:t>
-      </w:r>
-    </w:p>
-    <w:p>
-      <w:pPr>
-        <w:pStyle w:val="Heading1"/>
-        <w:rPr>
-          <w:rFonts w:eastAsia="Times New Roman"/>
-        </w:rPr>
-      </w:pPr>
-      <w:r>
-        <w:t xml:space="preserve">Hành vi nào sau đây </w:t>
-      </w:r>
-      <w:r>
-        <w:rPr>
-          <w:rFonts w:eastAsia="Times New Roman"/>
-        </w:rPr>
-        <w:t xml:space="preserve">bị xem là vi </w:t>
-      </w:r>
-      <w:r>
-        <w:t xml:space="preserve">phạm </w:t>
-      </w:r>
-      <w:r>
-        <w:rPr>
-          <w:rFonts w:eastAsia="Times New Roman"/>
-        </w:rPr>
-        <w:t xml:space="preserve">pháp </w:t>
-      </w:r>
-      <w:r>
-        <w:t xml:space="preserve">luật </w:t>
-      </w:r>
-      <w:r>
-        <w:rPr>
-          <w:rFonts w:eastAsia="Times New Roman"/>
-        </w:rPr>
-        <w:t xml:space="preserve">trên không </w:t>
-      </w:r>
-      <w:r>
-        <w:t>gian mạng</w:t>
-      </w:r>
-      <w:r>
-        <w:rPr>
-          <w:rFonts w:eastAsia="Times New Roman"/>
-        </w:rPr>
-        <w:t>?</w:t>
-      </w:r>
-    </w:p>
-    <w:p>
-      <w:pPr>
-        <w:pStyle w:val="Heading2"/>
-      </w:pPr>
-      <w:r>
-        <w:rPr>
-          <w:rFonts w:eastAsia="Times New Roman"/>
-        </w:rPr>
-        <w:t xml:space="preserve">Làm </w:t>
-      </w:r>
-      <w:r>
-        <w:t xml:space="preserve">tắc nghẽn hệ thống </w:t>
-      </w:r>
-      <w:r>
-        <w:rPr>
-          <w:rFonts w:eastAsia="Times New Roman"/>
-        </w:rPr>
-        <w:t xml:space="preserve">mạng </w:t>
-      </w:r>
-      <w:r>
-        <w:t>của nhà trường.</w:t>
-      </w:r>
-    </w:p>
-    <w:p>
-      <w:pPr>
-        <w:pStyle w:val="Heading2"/>
-      </w:pPr>
-      <w:r>
-        <w:t>Không trả lời tin nhắn ngay lập tức.</w:t>
-      </w:r>
-    </w:p>
-    <w:p>
-      <w:pPr>
-        <w:pStyle w:val="Heading2"/>
-      </w:pPr>
-      <w:r>
-        <w:t xml:space="preserve">Tải phần </w:t>
-      </w:r>
-      <w:r>
-        <w:rPr>
-          <w:rFonts w:eastAsia="Times New Roman"/>
-        </w:rPr>
-        <w:t xml:space="preserve">mềm </w:t>
-      </w:r>
-      <w:r>
-        <w:t xml:space="preserve">nguồn </w:t>
-      </w:r>
-      <w:r>
-        <w:rPr>
-          <w:rFonts w:eastAsia="Times New Roman"/>
-        </w:rPr>
-        <w:t xml:space="preserve">mở để </w:t>
-      </w:r>
-      <w:r>
-        <w:t>sử dụng.</w:t>
-      </w:r>
-    </w:p>
-    <w:p>
-      <w:pPr>
-        <w:pStyle w:val="Heading2"/>
-      </w:pPr>
-      <w:r>
-        <w:t>Gửi email cho bạn bè mà không ghi tiêu đề.</w:t>
-      </w:r>
-    </w:p>
-    <w:p>
-      <w:r>
-        <w:t>Đáp án:</w:t>
-      </w:r>
-      <w:r>
-        <w:t xml:space="preserve"> A</w:t>
-      </w:r>
-    </w:p>
-    <w:p>
-      <w:pPr>
-        <w:pStyle w:val="Heading1"/>
-      </w:pPr>
-      <w:r>
-        <w:t>Việc tự ý đăng tải hình ảnh của người khác lên mạng xã hội vi phạm quyền về vấn đề nào dưới đây?</w:t>
-      </w:r>
-    </w:p>
-    <w:p>
-      <w:pPr>
-        <w:pStyle w:val="Heading2"/>
-      </w:pPr>
-      <w:r>
-        <w:rPr>
-          <w:rFonts w:eastAsia="Times New Roman"/>
-        </w:rPr>
-        <w:t xml:space="preserve">Tự do </w:t>
-      </w:r>
-      <w:r>
-        <w:t>ngôn luận.</w:t>
-      </w:r>
-    </w:p>
-    <w:p>
-      <w:pPr>
-        <w:pStyle w:val="Heading2"/>
-      </w:pPr>
-      <w:r>
-        <w:t xml:space="preserve">Bảo mật thông tin </w:t>
-      </w:r>
-      <w:r>
-        <w:rPr>
-          <w:rFonts w:eastAsia="Times New Roman"/>
-        </w:rPr>
-        <w:t>cá nhân</w:t>
-      </w:r>
-      <w:r>
-        <w:t>.</w:t>
-      </w:r>
-    </w:p>
-    <w:p>
-      <w:pPr>
-        <w:pStyle w:val="Heading2"/>
-      </w:pPr>
-      <w:r>
-        <w:t>Sử dụng hình ảnh công khai.</w:t>
-      </w:r>
-    </w:p>
-    <w:p>
-      <w:pPr>
-        <w:pStyle w:val="Heading2"/>
-      </w:pPr>
-      <w:r>
-        <w:t>Phản hồi của người tiêu dùng.</w:t>
-      </w:r>
-    </w:p>
-    <w:p>
-      <w:r>
-        <w:t>Đáp án:</w:t>
-      </w:r>
-      <w:r>
-        <w:t xml:space="preserve"> B</w:t>
-      </w:r>
-    </w:p>
-    <w:p>
-      <w:pPr>
-        <w:pStyle w:val="Heading1"/>
-        <w:rPr>
-          <w:rFonts w:eastAsia="Times New Roman"/>
-        </w:rPr>
-      </w:pPr>
-      <w:r>
-        <w:rPr>
-          <w:rFonts w:eastAsia="Times New Roman"/>
-        </w:rPr>
-        <w:t xml:space="preserve">Công việc </w:t>
-      </w:r>
-      <w:r>
-        <w:t xml:space="preserve">nào </w:t>
-      </w:r>
-      <w:r>
-        <w:rPr>
-          <w:rFonts w:eastAsia="Times New Roman"/>
-        </w:rPr>
-        <w:t xml:space="preserve">dưới đây </w:t>
-      </w:r>
-      <w:r>
-        <w:t xml:space="preserve">thuộc nhóm nghề sửa chữa và bảo trì máy </w:t>
-      </w:r>
-      <w:r>
-        <w:rPr>
-          <w:rFonts w:eastAsia="Times New Roman"/>
-        </w:rPr>
-        <w:t>tính?</w:t>
-      </w:r>
-    </w:p>
-    <w:p>
-      <w:pPr>
-        <w:pStyle w:val="Heading2"/>
-      </w:pPr>
-      <w:r>
-        <w:t xml:space="preserve">Thiết kế và xây </w:t>
-      </w:r>
-      <w:r>
-        <w:rPr>
-          <w:rFonts w:eastAsia="Times New Roman"/>
-        </w:rPr>
-        <w:t xml:space="preserve">dựng </w:t>
-      </w:r>
-      <w:r>
-        <w:t>hệ điều hành.</w:t>
-      </w:r>
-    </w:p>
-    <w:p>
-      <w:pPr>
-        <w:pStyle w:val="Heading2"/>
-      </w:pPr>
-      <w:r>
-        <w:t>Cài đặt hoặc gỡ bỏ hệ điều hành.</w:t>
-      </w:r>
-    </w:p>
-    <w:p>
-      <w:pPr>
-        <w:pStyle w:val="Heading2"/>
-      </w:pPr>
-      <w:r>
-        <w:rPr>
-          <w:rFonts w:eastAsia="Times New Roman"/>
-        </w:rPr>
-        <w:t xml:space="preserve">Phát </w:t>
-      </w:r>
-      <w:r>
-        <w:t xml:space="preserve">triển phần mềm di </w:t>
-      </w:r>
-      <w:r>
-        <w:rPr>
-          <w:rFonts w:eastAsia="Times New Roman"/>
-        </w:rPr>
-        <w:t>động</w:t>
-      </w:r>
-      <w:r>
-        <w:t>.</w:t>
-      </w:r>
-    </w:p>
-    <w:p>
-      <w:pPr>
-        <w:pStyle w:val="Heading2"/>
-      </w:pPr>
-      <w:r>
-        <w:t xml:space="preserve">Xây dựng </w:t>
-      </w:r>
-      <w:r>
-        <w:rPr>
-          <w:rFonts w:eastAsia="Times New Roman"/>
-        </w:rPr>
-        <w:t xml:space="preserve">các </w:t>
-      </w:r>
-      <w:r>
-        <w:t xml:space="preserve">ứng dụng </w:t>
-      </w:r>
-      <w:r>
-        <w:rPr>
-          <w:rFonts w:eastAsia="Times New Roman"/>
-        </w:rPr>
-        <w:t>mạng</w:t>
-      </w:r>
-      <w:r>
-        <w:t>.</w:t>
-      </w:r>
-    </w:p>
-    <w:p>
-      <w:r>
-        <w:t>Đáp án:</w:t>
-      </w:r>
-      <w:r>
-        <w:t xml:space="preserve"> B</w:t>
-      </w:r>
-    </w:p>
-    <w:p>
-      <w:pPr>
-        <w:pStyle w:val="Heading1"/>
-      </w:pPr>
-      <w:r>
-        <w:lastRenderedPageBreak/>
         <w:t>Công việc nào dưới đây thuộc nghề quản trị mạng?</w:t>
       </w:r>
     </w:p>
@@ -3120,13 +3213,20 @@
         </w:rPr>
         <w:t>PART</w:t>
       </w:r>
-    </w:p>
-    <w:p>
       <w:r>
         <w:rPr>
           <w:b/>
           <w:bCs/>
         </w:rPr>
+        <w:t xml:space="preserve"> 2</w:t>
+      </w:r>
+    </w:p>
+    <w:p>
+      <w:r>
+        <w:rPr>
+          <w:b/>
+          <w:bCs/>
+        </w:rPr>
         <w:t>PHẦN II.</w:t>
       </w:r>
       <w:r>
@@ -3627,1127 +3727,937 @@
     </w:p>
     <w:p>
       <w:r>
-        <w:t>NHANVIEN (MaNV, HoTen, GioiTinh, NgaySinh) lưu thông tin: mã nhân viên, họ tên nhân viên, giới tính, ngày sinh.</w:t>
-      </w:r>
-    </w:p>
-    <w:p>
-      <w:r>
-        <w:t>DUAN (MaDA, TenDA, BatDau, KetThuc) lưu thông tin: mã dự án, tên dự án, ngày bắt đầu, ngày kết thúc.</w:t>
-      </w:r>
-    </w:p>
-    <w:p>
-      <w:r>
-        <w:t xml:space="preserve">THAMGIA (MaDA, MaNV, ViTri) lưu thông tin: mã dự án, mã nhân viên và vị trí </w:t>
-      </w:r>
-      <w:r>
-        <w:lastRenderedPageBreak/>
-        <w:t>nhân viên đó trong dự án.</w:t>
-      </w:r>
-    </w:p>
-    <w:p>
-      <w:r>
-        <w:t xml:space="preserve">Một </w:t>
-      </w:r>
-      <w:r>
-        <w:rPr>
-          <w:rFonts w:eastAsia="Times New Roman"/>
-        </w:rPr>
-        <w:t xml:space="preserve">nhân viên </w:t>
-      </w:r>
-      <w:r>
-        <w:t xml:space="preserve">của công ty có thể </w:t>
-      </w:r>
-      <w:r>
-        <w:rPr>
-          <w:rFonts w:eastAsia="Times New Roman"/>
-        </w:rPr>
-        <w:t xml:space="preserve">tham </w:t>
-      </w:r>
-      <w:r>
-        <w:t xml:space="preserve">gia nhiều dự </w:t>
-      </w:r>
-      <w:r>
-        <w:rPr>
-          <w:rFonts w:eastAsia="Times New Roman"/>
-        </w:rPr>
-        <w:t xml:space="preserve">án </w:t>
-      </w:r>
-      <w:r>
-        <w:t xml:space="preserve">và một dự </w:t>
-      </w:r>
-      <w:r>
-        <w:rPr>
-          <w:rFonts w:eastAsia="Times New Roman"/>
-        </w:rPr>
-        <w:t xml:space="preserve">án có </w:t>
-      </w:r>
-      <w:r>
-        <w:t xml:space="preserve">thể </w:t>
-      </w:r>
-      <w:r>
-        <w:rPr>
-          <w:rFonts w:eastAsia="Times New Roman"/>
-        </w:rPr>
-        <w:t xml:space="preserve">có </w:t>
-      </w:r>
-      <w:r>
-        <w:t xml:space="preserve">nhiều nhân </w:t>
-      </w:r>
-      <w:r>
-        <w:rPr>
-          <w:rFonts w:eastAsia="Times New Roman"/>
-        </w:rPr>
-        <w:t>viên</w:t>
-      </w:r>
-      <w:r>
-        <w:t xml:space="preserve">. </w:t>
-      </w:r>
-      <w:r>
-        <w:rPr>
-          <w:rFonts w:eastAsia="Times New Roman"/>
-        </w:rPr>
-        <w:t xml:space="preserve">Khi tìm hiểu </w:t>
-      </w:r>
-      <w:r>
-        <w:t xml:space="preserve">về cơ sở </w:t>
-      </w:r>
-      <w:r>
-        <w:rPr>
-          <w:rFonts w:eastAsia="Times New Roman"/>
-        </w:rPr>
-        <w:t xml:space="preserve">dữ liệu trên, </w:t>
-      </w:r>
-      <w:r>
-        <w:t xml:space="preserve">một số bạn </w:t>
-      </w:r>
-      <w:r>
-        <w:rPr>
-          <w:rFonts w:eastAsia="Times New Roman"/>
-        </w:rPr>
-        <w:t xml:space="preserve">học </w:t>
-      </w:r>
-      <w:r>
-        <w:t xml:space="preserve">sinh </w:t>
-      </w:r>
-      <w:r>
-        <w:rPr>
-          <w:rFonts w:eastAsia="Times New Roman"/>
-        </w:rPr>
-        <w:t xml:space="preserve">đưa ra các </w:t>
-      </w:r>
-      <w:r>
-        <w:t xml:space="preserve">nhận </w:t>
-      </w:r>
-      <w:r>
-        <w:rPr>
-          <w:rFonts w:eastAsia="Times New Roman"/>
-        </w:rPr>
-        <w:t>xét sau</w:t>
-      </w:r>
-      <w:r>
-        <w:t>:</w:t>
-      </w:r>
-      <w:r>
-        <w:t>}</w:t>
-      </w:r>
-    </w:p>
-    <w:p>
-      <w:pPr>
-        <w:pStyle w:val="Heading2"/>
-      </w:pPr>
-      <w:r>
-        <w:rPr>
-          <w:rFonts w:eastAsia="Times New Roman"/>
-        </w:rPr>
-        <w:t xml:space="preserve">HoTen là </w:t>
-      </w:r>
-      <w:r>
-        <w:t xml:space="preserve">một </w:t>
-      </w:r>
-      <w:r>
-        <w:rPr>
-          <w:rFonts w:eastAsia="Times New Roman"/>
+        <w:rPr>
           <w:i/>
           <w:iCs/>
         </w:rPr>
-        <w:t xml:space="preserve">trường </w:t>
-      </w:r>
-      <w:r>
-        <w:rPr>
-          <w:rFonts w:eastAsia="Times New Roman"/>
-        </w:rPr>
-        <w:t xml:space="preserve">tương ứng </w:t>
-      </w:r>
-      <w:r>
-        <w:t>với một cột của bảng NHANVIEN.</w:t>
-      </w:r>
-    </w:p>
-    <w:p>
-      <w:pPr>
-        <w:pStyle w:val="Heading2"/>
-      </w:pPr>
-      <w:r>
-        <w:t xml:space="preserve">Bộ hai </w:t>
-      </w:r>
-      <w:r>
-        <w:rPr>
-          <w:rFonts w:eastAsia="Times New Roman"/>
-        </w:rPr>
-        <w:t xml:space="preserve">thuộc </w:t>
-      </w:r>
-      <w:r>
-        <w:t xml:space="preserve">tính MaDA và MaNV </w:t>
-      </w:r>
-      <w:r>
-        <w:rPr>
-          <w:rFonts w:eastAsia="Times New Roman"/>
-        </w:rPr>
-        <w:t xml:space="preserve">là </w:t>
-      </w:r>
-      <w:r>
-        <w:t>khoá chính của bảng THAMGIA.</w:t>
-      </w:r>
-    </w:p>
-    <w:p>
-      <w:pPr>
-        <w:pStyle w:val="Heading2"/>
-      </w:pPr>
-      <w:r>
-        <w:t xml:space="preserve">Công ty sử dụng một </w:t>
-      </w:r>
-      <w:r>
-        <w:rPr>
-          <w:rFonts w:eastAsia="Times New Roman"/>
-        </w:rPr>
-        <w:t xml:space="preserve">máy chủ </w:t>
-      </w:r>
-      <w:r>
-        <w:t xml:space="preserve">để lưu dữ liệu, </w:t>
-      </w:r>
-      <w:r>
-        <w:rPr>
-          <w:rFonts w:eastAsia="Times New Roman"/>
-        </w:rPr>
-        <w:t xml:space="preserve">do </w:t>
-      </w:r>
-      <w:r>
-        <w:t xml:space="preserve">vậy </w:t>
-      </w:r>
-      <w:r>
-        <w:rPr>
-          <w:rFonts w:eastAsia="Times New Roman"/>
-        </w:rPr>
-        <w:t xml:space="preserve">phải </w:t>
-      </w:r>
-      <w:r>
-        <w:t>chọn hệ cơ sở dữ liệu phân tán để quản</w:t>
-      </w:r>
-      <w:r>
-        <w:t xml:space="preserve"> </w:t>
-      </w:r>
-      <w:r>
-        <w:rPr>
-          <w:rFonts w:eastAsia="Times New Roman"/>
-        </w:rPr>
-        <w:t xml:space="preserve">lí cơ </w:t>
-      </w:r>
-      <w:r>
-        <w:t xml:space="preserve">sở dữ </w:t>
-      </w:r>
-      <w:r>
-        <w:rPr>
-          <w:rFonts w:eastAsia="Times New Roman"/>
-        </w:rPr>
-        <w:t>liệu</w:t>
-      </w:r>
-      <w:r>
-        <w:t>.</w:t>
-      </w:r>
-    </w:p>
-    <w:p>
-      <w:pPr>
-        <w:pStyle w:val="Heading2"/>
-      </w:pPr>
-      <w:r>
-        <w:t>{</w:t>
-      </w:r>
-      <w:r>
-        <w:t>Câu lệnh SQL sau đây liệt kê họ tên các nhân viên và vị trí của họ trong dự án có mã dự án là 1.</w:t>
-      </w:r>
-    </w:p>
-    <w:p>
-      <w:r>
-        <w:t>SELECT NHANVIEN.HoTen</w:t>
-      </w:r>
-      <w:r>
-        <w:rPr>
-          <w:rFonts w:eastAsia="Courier New"/>
-        </w:rPr>
-        <w:t xml:space="preserve">, </w:t>
-      </w:r>
-      <w:r>
-        <w:t>THAMGIA.ViTri</w:t>
-      </w:r>
-    </w:p>
-    <w:p>
-      <w:r>
-        <w:t xml:space="preserve">FROM NHANVIEN INNER </w:t>
-      </w:r>
-      <w:r>
-        <w:rPr>
-          <w:rFonts w:eastAsia="Courier New"/>
-        </w:rPr>
-        <w:t xml:space="preserve">JOIN </w:t>
-      </w:r>
-      <w:r>
-        <w:t xml:space="preserve">THAMGIA ON NHANVIEN.MaNV </w:t>
-      </w:r>
-      <w:r>
-        <w:rPr>
-          <w:rFonts w:eastAsia="Courier New"/>
-        </w:rPr>
-        <w:t xml:space="preserve">= </w:t>
-      </w:r>
-      <w:r>
-        <w:t>THAMGIA.MaNV</w:t>
-      </w:r>
-    </w:p>
-    <w:p>
-      <w:r>
-        <w:t xml:space="preserve">WHERE MADA </w:t>
-      </w:r>
-      <w:r>
-        <w:rPr>
-          <w:rFonts w:eastAsia="Courier New"/>
-        </w:rPr>
-        <w:t xml:space="preserve">= </w:t>
-      </w:r>
-      <w:r>
-        <w:t>1</w:t>
-      </w:r>
-      <w:r>
-        <w:t>}</w:t>
-      </w:r>
-    </w:p>
-    <w:p>
-      <w:r>
-        <w:t>Đáp án:</w:t>
-      </w:r>
-      <w:r>
-        <w:t xml:space="preserve"> Đ Đ S Đ</w:t>
-      </w:r>
-    </w:p>
-    <w:p>
-      <w:pPr>
-        <w:pStyle w:val="Heading1"/>
-      </w:pPr>
-      <w:r>
-        <w:t>{</w:t>
-      </w:r>
-      <w:r>
-        <w:t xml:space="preserve">Một </w:t>
-      </w:r>
-      <w:r>
-        <w:rPr>
-          <w:rFonts w:eastAsia="Times New Roman"/>
-        </w:rPr>
-        <w:t xml:space="preserve">ngân hàng thương </w:t>
-      </w:r>
-      <w:r>
-        <w:t xml:space="preserve">mại cần </w:t>
-      </w:r>
-      <w:r>
-        <w:rPr>
-          <w:rFonts w:eastAsia="Times New Roman"/>
-        </w:rPr>
-        <w:t xml:space="preserve">phân </w:t>
-      </w:r>
-      <w:r>
-        <w:t xml:space="preserve">loại </w:t>
-      </w:r>
-      <w:r>
-        <w:rPr>
-          <w:rFonts w:eastAsia="Times New Roman"/>
-        </w:rPr>
-        <w:t xml:space="preserve">khách </w:t>
-      </w:r>
-      <w:r>
-        <w:t xml:space="preserve">hàng thành các nhóm: </w:t>
-      </w:r>
-      <w:r>
-        <w:rPr>
-          <w:rFonts w:eastAsia="Times New Roman"/>
-        </w:rPr>
-        <w:t>“tốt”, “</w:t>
-      </w:r>
-      <w:r>
-        <w:t xml:space="preserve">bình </w:t>
-      </w:r>
-      <w:r>
-        <w:rPr>
-          <w:rFonts w:eastAsia="Times New Roman"/>
-        </w:rPr>
-        <w:t xml:space="preserve">thường” và </w:t>
-      </w:r>
-      <w:r>
-        <w:t>“xấu</w:t>
-      </w:r>
-      <w:r>
-        <w:rPr>
-          <w:rFonts w:eastAsia="Times New Roman"/>
-        </w:rPr>
-        <w:t xml:space="preserve">” </w:t>
-      </w:r>
-      <w:r>
-        <w:t xml:space="preserve">theo hồ </w:t>
-      </w:r>
-      <w:r>
-        <w:rPr>
-          <w:rFonts w:eastAsia="Times New Roman"/>
-        </w:rPr>
-        <w:t xml:space="preserve">sơ </w:t>
-      </w:r>
-      <w:r>
-        <w:t xml:space="preserve">tín dụng </w:t>
-      </w:r>
-      <w:r>
-        <w:rPr>
-          <w:rFonts w:eastAsia="Times New Roman"/>
-        </w:rPr>
-        <w:t xml:space="preserve">để có </w:t>
-      </w:r>
-      <w:r>
-        <w:t xml:space="preserve">chính </w:t>
-      </w:r>
-      <w:r>
-        <w:rPr>
-          <w:rFonts w:eastAsia="Times New Roman"/>
-        </w:rPr>
-        <w:t xml:space="preserve">sách </w:t>
-      </w:r>
-      <w:r>
-        <w:t xml:space="preserve">lãi suất </w:t>
-      </w:r>
-      <w:r>
-        <w:rPr>
-          <w:rFonts w:eastAsia="Times New Roman"/>
-        </w:rPr>
-        <w:t xml:space="preserve">cho </w:t>
-      </w:r>
-      <w:r>
-        <w:t xml:space="preserve">vay </w:t>
-      </w:r>
-      <w:r>
-        <w:rPr>
-          <w:rFonts w:eastAsia="Times New Roman"/>
-        </w:rPr>
-        <w:t xml:space="preserve">phù hợp. Có </w:t>
-      </w:r>
-      <w:r>
-        <w:t xml:space="preserve">2 bạn học </w:t>
-      </w:r>
-      <w:r>
-        <w:rPr>
-          <w:rFonts w:eastAsia="Times New Roman"/>
-        </w:rPr>
-        <w:t xml:space="preserve">sinh </w:t>
-      </w:r>
-      <w:r>
-        <w:t xml:space="preserve">đề xuất </w:t>
-      </w:r>
-      <w:r>
-        <w:rPr>
-          <w:rFonts w:eastAsia="Times New Roman"/>
-        </w:rPr>
-        <w:t xml:space="preserve">phương pháp như </w:t>
-      </w:r>
-      <w:r>
-        <w:t>sau:</w:t>
-      </w:r>
-    </w:p>
-    <w:p>
-      <w:r>
-        <w:t>Học sinh A: Mời các chuyên gia tài chính gán nhãn “tốt”, “bình thường” và “xấu” cho từng khách hàng trong một tập khách hàng được chọn. Máy tính học cách phân loại từ tập dữ liệu đã gán nhãn này để phân loại cho các khách hàng khác.</w:t>
-      </w:r>
-    </w:p>
-    <w:p>
-      <w:r>
-        <w:t>Học sinh B: Máy tính tự động phân cụm toàn bộ tập dữ liệu khách hàng thành 3 cụm. Sau đó các chuyên gia được mời để gán nhãn cho các cụm này là “tốt”, “bình thường” và “xấu”.</w:t>
-      </w:r>
-    </w:p>
-    <w:p>
-      <w:r>
-        <w:t xml:space="preserve">Một số bạn học </w:t>
-      </w:r>
-      <w:r>
-        <w:rPr>
-          <w:rFonts w:eastAsia="Times New Roman"/>
-        </w:rPr>
-        <w:t xml:space="preserve">sinh </w:t>
-      </w:r>
-      <w:r>
-        <w:t xml:space="preserve">có ý kiến </w:t>
-      </w:r>
-      <w:r>
-        <w:rPr>
-          <w:rFonts w:eastAsia="Times New Roman"/>
-        </w:rPr>
-        <w:t xml:space="preserve">như </w:t>
-      </w:r>
-      <w:r>
-        <w:t>sau:</w:t>
-      </w:r>
-      <w:r>
-        <w:t>}</w:t>
-      </w:r>
-    </w:p>
-    <w:p>
-      <w:pPr>
-        <w:pStyle w:val="Heading2"/>
-      </w:pPr>
-      <w:r>
-        <w:t>Phương pháp của bạn học sinh A là theo mô hình học máy có giám sát.</w:t>
-      </w:r>
-    </w:p>
-    <w:p>
-      <w:pPr>
-        <w:pStyle w:val="Heading2"/>
-      </w:pPr>
-      <w:r>
-        <w:t>Phương pháp của bạn học sinh B là theo mô hình học máy không giám sát.</w:t>
-      </w:r>
-    </w:p>
-    <w:p>
-      <w:pPr>
-        <w:pStyle w:val="Heading2"/>
-      </w:pPr>
-      <w:r>
-        <w:t>Phương pháp phân loại khách hàng của học sinh B tốt hơn của học sinh A.</w:t>
-      </w:r>
-    </w:p>
-    <w:p>
-      <w:pPr>
-        <w:pStyle w:val="Heading2"/>
-      </w:pPr>
-      <w:r>
-        <w:t>Phương pháp thu thập dữ liệu sinh trắc học khuôn mặt có thể giúp ngân hàng giải quyết bài toán phân loại khách hàng thành các nhóm đã nêu.</w:t>
-      </w:r>
-    </w:p>
-    <w:p>
-      <w:r>
-        <w:t>Đáp án:</w:t>
-      </w:r>
-      <w:r>
-        <w:t xml:space="preserve"> Đ Đ S S</w:t>
-      </w:r>
-    </w:p>
-    <w:p>
-      <w:pPr>
-        <w:pStyle w:val="Heading1"/>
-        <w:rPr>
-          <w:rFonts w:eastAsia="Times New Roman"/>
-        </w:rPr>
-      </w:pPr>
-      <w:r>
-        <w:rPr>
-          <w:rFonts w:eastAsia="Times New Roman"/>
-        </w:rPr>
-        <w:t>{</w:t>
-      </w:r>
-      <w:r>
-        <w:rPr>
-          <w:rFonts w:eastAsia="Times New Roman"/>
-        </w:rPr>
-        <w:t xml:space="preserve">Chọn </w:t>
-      </w:r>
-      <w:r>
-        <w:t xml:space="preserve">một trong hai ngôn </w:t>
-      </w:r>
-      <w:r>
-        <w:rPr>
-          <w:rFonts w:eastAsia="Times New Roman"/>
-        </w:rPr>
-        <w:t xml:space="preserve">ngữ </w:t>
-      </w:r>
-      <w:r>
-        <w:t xml:space="preserve">Python </w:t>
-      </w:r>
-      <w:r>
-        <w:rPr>
-          <w:rFonts w:eastAsia="Times New Roman"/>
-        </w:rPr>
-        <w:t xml:space="preserve">hoặc C++ để </w:t>
-      </w:r>
-      <w:r>
-        <w:t xml:space="preserve">tìm hiểu một </w:t>
-      </w:r>
-      <w:r>
-        <w:rPr>
-          <w:rFonts w:eastAsia="Times New Roman"/>
-        </w:rPr>
-        <w:t xml:space="preserve">hàm cho </w:t>
-      </w:r>
-      <w:r>
-        <w:t xml:space="preserve">dưới </w:t>
-      </w:r>
-      <w:r>
-        <w:rPr>
-          <w:rFonts w:eastAsia="Times New Roman"/>
-        </w:rPr>
-        <w:t>đây:</w:t>
-      </w:r>
-    </w:p>
-    <w:p>
-      <w:r>
-        <w:t>Hàm viết bằng ngôn ngữ Python</w:t>
-      </w:r>
-    </w:p>
-    <w:p>
-      <w:r>
-        <w:t>def find(x, a, n):</w:t>
-      </w:r>
-    </w:p>
-    <w:p>
-      <w:pPr>
-        <w:rPr>
-          <w:rFonts w:eastAsia="Courier New"/>
-        </w:rPr>
-      </w:pPr>
-      <w:r>
-        <w:t xml:space="preserve">found </w:t>
-      </w:r>
-      <w:r>
-        <w:rPr>
-          <w:rFonts w:eastAsia="Times New Roman"/>
-        </w:rPr>
-        <w:t xml:space="preserve">= </w:t>
-      </w:r>
-      <w:r>
-        <w:rPr>
-          <w:rFonts w:eastAsia="Courier New"/>
-        </w:rPr>
-        <w:t>False</w:t>
-      </w:r>
-    </w:p>
-    <w:p>
-      <w:r>
-        <w:lastRenderedPageBreak/>
-        <w:t>i = 0</w:t>
-      </w:r>
-    </w:p>
-    <w:p>
-      <w:r>
-        <w:t>while (i&lt;n) and not found:</w:t>
-      </w:r>
-    </w:p>
-    <w:p>
-      <w:r>
-        <w:t>if a[i] == X:</w:t>
-      </w:r>
-    </w:p>
-    <w:p>
-      <w:r>
-        <w:t xml:space="preserve">found </w:t>
-      </w:r>
-      <w:r>
-        <w:rPr>
-          <w:rFonts w:eastAsia="Courier New"/>
-        </w:rPr>
-        <w:t xml:space="preserve">= </w:t>
-      </w:r>
-      <w:r>
-        <w:t>True</w:t>
-      </w:r>
-    </w:p>
-    <w:p>
-      <w:pPr>
-        <w:rPr>
-          <w:rFonts w:eastAsia="Times New Roman"/>
-        </w:rPr>
-      </w:pPr>
-      <w:r>
-        <w:t xml:space="preserve">i = i </w:t>
-      </w:r>
-      <w:r>
-        <w:rPr>
-          <w:rFonts w:eastAsia="Times New Roman"/>
-        </w:rPr>
-        <w:t>+ 1</w:t>
-      </w:r>
-    </w:p>
-    <w:p>
-      <w:r>
-        <w:t>return found</w:t>
-      </w:r>
-    </w:p>
-    <w:p>
-      <w:r>
-        <w:t>Hàm viết bằng ngôn ngữ C++</w:t>
-      </w:r>
-    </w:p>
-    <w:p>
-      <w:r>
-        <w:t xml:space="preserve">bool find(int x, int </w:t>
-      </w:r>
-      <w:r>
-        <w:rPr>
-          <w:rFonts w:eastAsia="Times New Roman"/>
-        </w:rPr>
-        <w:t>a</w:t>
-      </w:r>
-      <w:r>
-        <w:t>[], int n) {</w:t>
-      </w:r>
-    </w:p>
-    <w:p>
-      <w:pPr>
-        <w:rPr>
-          <w:rFonts w:eastAsia="Times New Roman"/>
-        </w:rPr>
-      </w:pPr>
-      <w:r>
-        <w:rPr>
-          <w:rFonts w:eastAsia="Courier New"/>
-        </w:rPr>
-        <w:t xml:space="preserve">bool </w:t>
-      </w:r>
-      <w:r>
-        <w:t xml:space="preserve">found </w:t>
-      </w:r>
-      <w:r>
-        <w:rPr>
-          <w:rFonts w:eastAsia="Times New Roman"/>
-        </w:rPr>
-        <w:t>=</w:t>
-      </w:r>
-    </w:p>
-    <w:p>
-      <w:r>
-        <w:t>false;</w:t>
-      </w:r>
-    </w:p>
-    <w:p>
-      <w:r>
-        <w:t>int i = 0;</w:t>
-      </w:r>
-    </w:p>
-    <w:p>
-      <w:r>
-        <w:t>while (i&lt;n &amp;&amp; ! found) {</w:t>
-      </w:r>
-    </w:p>
-    <w:p>
-      <w:r>
-        <w:t>if (a[i]</w:t>
-      </w:r>
-    </w:p>
-    <w:p>
-      <w:r>
-        <w:t>==</w:t>
-      </w:r>
-    </w:p>
-    <w:p>
-      <w:r>
-        <w:t>x)</w:t>
-      </w:r>
-    </w:p>
-    <w:p>
-      <w:r>
-        <w:t>i = i + 1; }</w:t>
-      </w:r>
-      <w:r>
-        <w:t>\</w:t>
-      </w:r>
-    </w:p>
-    <w:p>
-      <w:pPr>
-        <w:rPr>
-          <w:rFonts w:eastAsia="Courier New"/>
-        </w:rPr>
-      </w:pPr>
-      <w:r>
-        <w:t xml:space="preserve">found </w:t>
-      </w:r>
-      <w:r>
-        <w:rPr>
-          <w:rFonts w:eastAsia="Courier New"/>
-        </w:rPr>
-        <w:t xml:space="preserve">= </w:t>
-      </w:r>
-      <w:r>
-        <w:t>true</w:t>
-      </w:r>
-      <w:r>
-        <w:rPr>
-          <w:rFonts w:eastAsia="Courier New"/>
-        </w:rPr>
-        <w:t>;</w:t>
-      </w:r>
-    </w:p>
-    <w:p>
-      <w:r>
-        <w:t xml:space="preserve">return found; </w:t>
-      </w:r>
-      <w:r>
-        <w:rPr>
-          <w:rFonts w:eastAsia="Courier New"/>
-        </w:rPr>
-        <w:t>}</w:t>
-      </w:r>
-      <w:r>
-        <w:rPr>
-          <w:rFonts w:eastAsia="Courier New"/>
-        </w:rPr>
-        <w:t>\</w:t>
-      </w:r>
-    </w:p>
-    <w:p>
-      <w:r>
-        <w:t xml:space="preserve">Một số bạn học sinh nhận </w:t>
-      </w:r>
-      <w:r>
-        <w:rPr>
-          <w:rFonts w:eastAsia="Times New Roman"/>
-        </w:rPr>
-        <w:t xml:space="preserve">xét </w:t>
-      </w:r>
-      <w:r>
-        <w:t xml:space="preserve">về hàm trên </w:t>
-      </w:r>
-      <w:r>
-        <w:rPr>
-          <w:rFonts w:eastAsia="Times New Roman"/>
-        </w:rPr>
-        <w:t xml:space="preserve">như </w:t>
-      </w:r>
-      <w:r>
-        <w:t>sau:</w:t>
-      </w:r>
-      <w:r>
-        <w:t>}</w:t>
-      </w:r>
-    </w:p>
-    <w:p>
-      <w:pPr>
-        <w:pStyle w:val="Heading2"/>
-      </w:pPr>
-      <w:r>
-        <w:t xml:space="preserve">Hàm thể hiện một thuật </w:t>
-      </w:r>
-      <w:r>
-        <w:rPr>
-          <w:rFonts w:eastAsia="Times New Roman"/>
-        </w:rPr>
-        <w:t xml:space="preserve">toán </w:t>
-      </w:r>
-      <w:r>
-        <w:t>đệ quy.</w:t>
-      </w:r>
-    </w:p>
-    <w:p>
-      <w:pPr>
-        <w:pStyle w:val="Heading2"/>
-      </w:pPr>
-      <w:r>
-        <w:rPr>
-          <w:rFonts w:eastAsia="Times New Roman"/>
-        </w:rPr>
-        <w:t xml:space="preserve">Các </w:t>
-      </w:r>
-      <w:r>
-        <w:t xml:space="preserve">thao tác </w:t>
-      </w:r>
-      <w:r>
-        <w:rPr>
-          <w:rFonts w:eastAsia="Times New Roman"/>
-        </w:rPr>
-        <w:t xml:space="preserve">với </w:t>
-      </w:r>
-      <w:r>
-        <w:t xml:space="preserve">mảng </w:t>
-      </w:r>
-      <w:r>
-        <w:rPr>
-          <w:rFonts w:eastAsia="Times New Roman"/>
-        </w:rPr>
-        <w:t xml:space="preserve">a trong hàm </w:t>
-      </w:r>
-      <w:r>
-        <w:t xml:space="preserve">không phải là </w:t>
-      </w:r>
-      <w:r>
-        <w:rPr>
-          <w:rFonts w:eastAsia="Times New Roman"/>
-        </w:rPr>
-        <w:t xml:space="preserve">thao tác </w:t>
-      </w:r>
-      <w:r>
-        <w:t xml:space="preserve">trên kiểu dữ liệu </w:t>
-      </w:r>
-      <w:r>
-        <w:rPr>
-          <w:rFonts w:eastAsia="Times New Roman"/>
-        </w:rPr>
-        <w:t>ngăn xếp</w:t>
-      </w:r>
-      <w:r>
-        <w:t>.</w:t>
-      </w:r>
-    </w:p>
-    <w:p>
-      <w:pPr>
-        <w:pStyle w:val="Heading2"/>
-      </w:pPr>
-      <w:r>
-        <w:t xml:space="preserve">Hàm </w:t>
-      </w:r>
-      <w:r>
-        <w:rPr>
-          <w:rFonts w:eastAsia="Times New Roman"/>
-        </w:rPr>
-        <w:t xml:space="preserve">có </w:t>
-      </w:r>
-      <w:r>
-        <w:t xml:space="preserve">độ </w:t>
-      </w:r>
-      <w:r>
-        <w:rPr>
-          <w:rFonts w:eastAsia="Times New Roman"/>
-        </w:rPr>
-        <w:t xml:space="preserve">phức </w:t>
-      </w:r>
-      <w:r>
-        <w:t xml:space="preserve">tạp thuật toán </w:t>
-      </w:r>
-      <w:r>
-        <w:rPr>
-          <w:rFonts w:eastAsia="Times New Roman"/>
-        </w:rPr>
-        <w:t>là O(n</w:t>
-      </w:r>
-      <w:r>
-        <w:t>).</w:t>
-      </w:r>
-    </w:p>
-    <w:p>
-      <w:pPr>
-        <w:pStyle w:val="Heading2"/>
-      </w:pPr>
-      <w:r>
-        <w:t>Nếu mảng a =</w:t>
-      </w:r>
-      <w:r>
-        <w:t xml:space="preserve"> </w:t>
-      </w:r>
-      <w:r>
-        <w:t>{2, 6, 3, 8} và x = 9 thì hàm trả về giá trị logic sai.</w:t>
-      </w:r>
-    </w:p>
-    <w:p>
-      <w:r>
-        <w:t>Đáp án:</w:t>
-      </w:r>
-      <w:r>
-        <w:t xml:space="preserve"> S Đ S Đ</w:t>
-      </w:r>
-    </w:p>
-    <w:p>
-      <w:pPr>
-        <w:pStyle w:val="Heading1"/>
-      </w:pPr>
-      <w:r>
-        <w:t>{</w:t>
-      </w:r>
-      <w:r>
-        <w:t xml:space="preserve">Một </w:t>
-      </w:r>
-      <w:r>
-        <w:rPr>
-          <w:rFonts w:eastAsia="Times New Roman"/>
-        </w:rPr>
-        <w:t xml:space="preserve">học </w:t>
-      </w:r>
-      <w:r>
-        <w:t xml:space="preserve">sinh </w:t>
-      </w:r>
-      <w:r>
-        <w:rPr>
-          <w:rFonts w:eastAsia="Times New Roman"/>
-        </w:rPr>
-        <w:t xml:space="preserve">thực </w:t>
-      </w:r>
-      <w:r>
-        <w:t xml:space="preserve">hiện tạo </w:t>
-      </w:r>
-      <w:r>
-        <w:rPr>
-          <w:rFonts w:eastAsia="Times New Roman"/>
-        </w:rPr>
-        <w:t xml:space="preserve">website </w:t>
-      </w:r>
-      <w:r>
-        <w:t xml:space="preserve">cho một tổ chức từ thiện gồm 3 </w:t>
-      </w:r>
-      <w:r>
-        <w:rPr>
-          <w:rFonts w:eastAsia="Times New Roman"/>
-        </w:rPr>
-        <w:t xml:space="preserve">trang web </w:t>
-      </w:r>
-      <w:r>
-        <w:t xml:space="preserve">sau: </w:t>
-      </w:r>
-      <w:r>
-        <w:rPr>
-          <w:rFonts w:eastAsia="Times New Roman"/>
+        <w:t>NHANVIEN (MaNV, HoTen, GioiTinh, NgaySinh)</w:t>
+      </w:r>
+      <w:r>
+        <w:t xml:space="preserve"> lưu thông tin: mã nhân viên, họ tên nhân viên, giới tính, ngày sinh.</w:t>
+      </w:r>
+    </w:p>
+    <w:p>
+      <w:r>
+        <w:rPr>
           <w:i/>
           <w:iCs/>
         </w:rPr>
-        <w:t>Giới thiệu về tổ chức</w:t>
-      </w:r>
-      <w:r>
-        <w:t xml:space="preserve">, </w:t>
-      </w:r>
-      <w:r>
-        <w:rPr>
-          <w:rFonts w:eastAsia="Times New Roman"/>
+        <w:lastRenderedPageBreak/>
+        <w:t>DUAN (MaDA, TenDA, BatDau, KetThuc)</w:t>
+      </w:r>
+      <w:r>
+        <w:t xml:space="preserve"> lưu thông tin: mã dự án, tên dự án, ngày bắt đầu, ngày kết thúc.</w:t>
+      </w:r>
+    </w:p>
+    <w:p>
+      <w:r>
+        <w:rPr>
           <w:i/>
           <w:iCs/>
         </w:rPr>
-        <w:t xml:space="preserve">Thông tin dự </w:t>
-      </w:r>
-      <w:r>
-        <w:rPr>
+        <w:t>THAMGIA (MaDA, MaNV, ViTri)</w:t>
+      </w:r>
+      <w:r>
+        <w:t xml:space="preserve"> lưu thông tin: mã dự án, mã nhân viên và vị trí nhân viên đó trong dự án.</w:t>
+      </w:r>
+    </w:p>
+    <w:p>
+      <w:r>
+        <w:t xml:space="preserve">Một </w:t>
+      </w:r>
+      <w:r>
+        <w:rPr>
+          <w:rFonts w:eastAsia="Times New Roman"/>
+        </w:rPr>
+        <w:t xml:space="preserve">nhân viên </w:t>
+      </w:r>
+      <w:r>
+        <w:t xml:space="preserve">của công ty có thể </w:t>
+      </w:r>
+      <w:r>
+        <w:rPr>
+          <w:rFonts w:eastAsia="Times New Roman"/>
+        </w:rPr>
+        <w:t xml:space="preserve">tham </w:t>
+      </w:r>
+      <w:r>
+        <w:t xml:space="preserve">gia nhiều dự </w:t>
+      </w:r>
+      <w:r>
+        <w:rPr>
+          <w:rFonts w:eastAsia="Times New Roman"/>
+        </w:rPr>
+        <w:t xml:space="preserve">án </w:t>
+      </w:r>
+      <w:r>
+        <w:t xml:space="preserve">và một dự </w:t>
+      </w:r>
+      <w:r>
+        <w:rPr>
+          <w:rFonts w:eastAsia="Times New Roman"/>
+        </w:rPr>
+        <w:t xml:space="preserve">án có </w:t>
+      </w:r>
+      <w:r>
+        <w:t xml:space="preserve">thể </w:t>
+      </w:r>
+      <w:r>
+        <w:rPr>
+          <w:rFonts w:eastAsia="Times New Roman"/>
+        </w:rPr>
+        <w:t xml:space="preserve">có </w:t>
+      </w:r>
+      <w:r>
+        <w:t xml:space="preserve">nhiều nhân </w:t>
+      </w:r>
+      <w:r>
+        <w:rPr>
+          <w:rFonts w:eastAsia="Times New Roman"/>
+        </w:rPr>
+        <w:t>viên</w:t>
+      </w:r>
+      <w:r>
+        <w:t xml:space="preserve">. </w:t>
+      </w:r>
+      <w:r>
+        <w:rPr>
+          <w:rFonts w:eastAsia="Times New Roman"/>
+        </w:rPr>
+        <w:t xml:space="preserve">Khi tìm hiểu </w:t>
+      </w:r>
+      <w:r>
+        <w:t xml:space="preserve">về cơ sở </w:t>
+      </w:r>
+      <w:r>
+        <w:rPr>
+          <w:rFonts w:eastAsia="Times New Roman"/>
+        </w:rPr>
+        <w:t xml:space="preserve">dữ liệu trên, </w:t>
+      </w:r>
+      <w:r>
+        <w:t xml:space="preserve">một số bạn </w:t>
+      </w:r>
+      <w:r>
+        <w:rPr>
+          <w:rFonts w:eastAsia="Times New Roman"/>
+        </w:rPr>
+        <w:t xml:space="preserve">học </w:t>
+      </w:r>
+      <w:r>
+        <w:t xml:space="preserve">sinh </w:t>
+      </w:r>
+      <w:r>
+        <w:rPr>
+          <w:rFonts w:eastAsia="Times New Roman"/>
+        </w:rPr>
+        <w:t xml:space="preserve">đưa ra các </w:t>
+      </w:r>
+      <w:r>
+        <w:t xml:space="preserve">nhận </w:t>
+      </w:r>
+      <w:r>
+        <w:rPr>
+          <w:rFonts w:eastAsia="Times New Roman"/>
+        </w:rPr>
+        <w:t>xét sau</w:t>
+      </w:r>
+      <w:r>
+        <w:t>:</w:t>
+      </w:r>
+      <w:r>
+        <w:t>}</w:t>
+      </w:r>
+    </w:p>
+    <w:p>
+      <w:pPr>
+        <w:pStyle w:val="Heading2"/>
+      </w:pPr>
+      <w:r>
+        <w:rPr>
+          <w:rFonts w:eastAsia="Times New Roman"/>
+        </w:rPr>
+        <w:t xml:space="preserve">HoTen là </w:t>
+      </w:r>
+      <w:r>
+        <w:t xml:space="preserve">một </w:t>
+      </w:r>
+      <w:r>
+        <w:rPr>
+          <w:rFonts w:eastAsia="Times New Roman"/>
           <w:i/>
           <w:iCs/>
         </w:rPr>
-        <w:t>án</w:t>
-      </w:r>
-      <w:r>
-        <w:rPr>
-          <w:rFonts w:eastAsia="Times New Roman"/>
+        <w:t xml:space="preserve">trường </w:t>
+      </w:r>
+      <w:r>
+        <w:rPr>
+          <w:rFonts w:eastAsia="Times New Roman"/>
+        </w:rPr>
+        <w:t xml:space="preserve">tương ứng </w:t>
+      </w:r>
+      <w:r>
+        <w:t>với một cột của bảng NHANVIEN.</w:t>
+      </w:r>
+    </w:p>
+    <w:p>
+      <w:pPr>
+        <w:pStyle w:val="Heading2"/>
+      </w:pPr>
+      <w:r>
+        <w:t xml:space="preserve">Bộ hai </w:t>
+      </w:r>
+      <w:r>
+        <w:rPr>
+          <w:rFonts w:eastAsia="Times New Roman"/>
+        </w:rPr>
+        <w:t xml:space="preserve">thuộc </w:t>
+      </w:r>
+      <w:r>
+        <w:t xml:space="preserve">tính MaDA và MaNV </w:t>
+      </w:r>
+      <w:r>
+        <w:rPr>
+          <w:rFonts w:eastAsia="Times New Roman"/>
+        </w:rPr>
+        <w:t xml:space="preserve">là </w:t>
+      </w:r>
+      <w:r>
+        <w:t>khoá chính của bảng THAMGIA.</w:t>
+      </w:r>
+    </w:p>
+    <w:p>
+      <w:pPr>
+        <w:pStyle w:val="Heading2"/>
+      </w:pPr>
+      <w:r>
+        <w:t xml:space="preserve">Công ty sử dụng một </w:t>
+      </w:r>
+      <w:r>
+        <w:rPr>
+          <w:rFonts w:eastAsia="Times New Roman"/>
+        </w:rPr>
+        <w:t xml:space="preserve">máy chủ </w:t>
+      </w:r>
+      <w:r>
+        <w:t xml:space="preserve">để lưu dữ liệu, </w:t>
+      </w:r>
+      <w:r>
+        <w:rPr>
+          <w:rFonts w:eastAsia="Times New Roman"/>
+        </w:rPr>
+        <w:t xml:space="preserve">do </w:t>
+      </w:r>
+      <w:r>
+        <w:t xml:space="preserve">vậy </w:t>
+      </w:r>
+      <w:r>
+        <w:rPr>
+          <w:rFonts w:eastAsia="Times New Roman"/>
+        </w:rPr>
+        <w:t xml:space="preserve">phải </w:t>
+      </w:r>
+      <w:r>
+        <w:t>chọn hệ cơ sở dữ liệu phân tán để quản</w:t>
+      </w:r>
+      <w:r>
+        <w:t xml:space="preserve"> </w:t>
+      </w:r>
+      <w:r>
+        <w:rPr>
+          <w:rFonts w:eastAsia="Times New Roman"/>
+        </w:rPr>
+        <w:t xml:space="preserve">lí cơ </w:t>
+      </w:r>
+      <w:r>
+        <w:t xml:space="preserve">sở dữ </w:t>
+      </w:r>
+      <w:r>
+        <w:rPr>
+          <w:rFonts w:eastAsia="Times New Roman"/>
+        </w:rPr>
+        <w:t>liệu</w:t>
+      </w:r>
+      <w:r>
+        <w:t>.</w:t>
+      </w:r>
+    </w:p>
+    <w:p>
+      <w:pPr>
+        <w:pStyle w:val="Heading2"/>
+      </w:pPr>
+      <w:r>
+        <w:t>{</w:t>
+      </w:r>
+      <w:r>
+        <w:t>Câu lệnh SQL sau đây liệt kê họ tên các nhân viên và vị trí của họ trong dự án có mã dự án là 1.</w:t>
+      </w:r>
+    </w:p>
+    <w:p>
+      <w:r>
+        <w:t>SELECT NHANVIEN.HoTen</w:t>
+      </w:r>
+      <w:r>
+        <w:rPr>
+          <w:rFonts w:eastAsia="Courier New"/>
+        </w:rPr>
+        <w:t xml:space="preserve">, </w:t>
+      </w:r>
+      <w:r>
+        <w:t>THAMGIA.ViTri</w:t>
+      </w:r>
+    </w:p>
+    <w:p>
+      <w:r>
+        <w:t xml:space="preserve">FROM NHANVIEN INNER </w:t>
+      </w:r>
+      <w:r>
+        <w:rPr>
+          <w:rFonts w:eastAsia="Courier New"/>
+        </w:rPr>
+        <w:t xml:space="preserve">JOIN </w:t>
+      </w:r>
+      <w:r>
+        <w:t xml:space="preserve">THAMGIA ON NHANVIEN.MaNV </w:t>
+      </w:r>
+      <w:r>
+        <w:rPr>
+          <w:rFonts w:eastAsia="Courier New"/>
+        </w:rPr>
+        <w:t xml:space="preserve">= </w:t>
+      </w:r>
+      <w:r>
+        <w:t>THAMGIA.MaNV</w:t>
+      </w:r>
+    </w:p>
+    <w:p>
+      <w:r>
+        <w:t xml:space="preserve">WHERE MADA </w:t>
+      </w:r>
+      <w:r>
+        <w:rPr>
+          <w:rFonts w:eastAsia="Courier New"/>
+        </w:rPr>
+        <w:t xml:space="preserve">= </w:t>
+      </w:r>
+      <w:r>
+        <w:t>1</w:t>
+      </w:r>
+      <w:r>
+        <w:t>}</w:t>
+      </w:r>
+    </w:p>
+    <w:p>
+      <w:r>
+        <w:t>Đáp án:</w:t>
+      </w:r>
+      <w:r>
+        <w:t xml:space="preserve"> Đ Đ S Đ</w:t>
+      </w:r>
+    </w:p>
+    <w:p>
+      <w:pPr>
+        <w:pStyle w:val="Heading1"/>
+      </w:pPr>
+      <w:r>
+        <w:t>{</w:t>
+      </w:r>
+      <w:r>
+        <w:t xml:space="preserve">Một </w:t>
+      </w:r>
+      <w:r>
+        <w:rPr>
+          <w:rFonts w:eastAsia="Times New Roman"/>
+        </w:rPr>
+        <w:t xml:space="preserve">ngân hàng thương </w:t>
+      </w:r>
+      <w:r>
+        <w:t xml:space="preserve">mại cần </w:t>
+      </w:r>
+      <w:r>
+        <w:rPr>
+          <w:rFonts w:eastAsia="Times New Roman"/>
+        </w:rPr>
+        <w:t xml:space="preserve">phân </w:t>
+      </w:r>
+      <w:r>
+        <w:t xml:space="preserve">loại </w:t>
+      </w:r>
+      <w:r>
+        <w:rPr>
+          <w:rFonts w:eastAsia="Times New Roman"/>
+        </w:rPr>
+        <w:t xml:space="preserve">khách </w:t>
+      </w:r>
+      <w:r>
+        <w:t xml:space="preserve">hàng thành các nhóm: </w:t>
+      </w:r>
+      <w:r>
+        <w:rPr>
+          <w:rFonts w:eastAsia="Times New Roman"/>
+        </w:rPr>
+        <w:t>“tốt”, “</w:t>
+      </w:r>
+      <w:r>
+        <w:t xml:space="preserve">bình </w:t>
+      </w:r>
+      <w:r>
+        <w:rPr>
+          <w:rFonts w:eastAsia="Times New Roman"/>
+        </w:rPr>
+        <w:t xml:space="preserve">thường” và </w:t>
+      </w:r>
+      <w:r>
+        <w:t>“xấu</w:t>
+      </w:r>
+      <w:r>
+        <w:rPr>
+          <w:rFonts w:eastAsia="Times New Roman"/>
+        </w:rPr>
+        <w:t xml:space="preserve">” </w:t>
+      </w:r>
+      <w:r>
+        <w:t xml:space="preserve">theo hồ </w:t>
+      </w:r>
+      <w:r>
+        <w:rPr>
+          <w:rFonts w:eastAsia="Times New Roman"/>
+        </w:rPr>
+        <w:t xml:space="preserve">sơ </w:t>
+      </w:r>
+      <w:r>
+        <w:t xml:space="preserve">tín dụng </w:t>
+      </w:r>
+      <w:r>
+        <w:rPr>
+          <w:rFonts w:eastAsia="Times New Roman"/>
+        </w:rPr>
+        <w:t xml:space="preserve">để có </w:t>
+      </w:r>
+      <w:r>
+        <w:t xml:space="preserve">chính </w:t>
+      </w:r>
+      <w:r>
+        <w:rPr>
+          <w:rFonts w:eastAsia="Times New Roman"/>
+        </w:rPr>
+        <w:t xml:space="preserve">sách </w:t>
+      </w:r>
+      <w:r>
+        <w:t xml:space="preserve">lãi suất </w:t>
+      </w:r>
+      <w:r>
+        <w:rPr>
+          <w:rFonts w:eastAsia="Times New Roman"/>
+        </w:rPr>
+        <w:t xml:space="preserve">cho </w:t>
+      </w:r>
+      <w:r>
+        <w:t xml:space="preserve">vay </w:t>
+      </w:r>
+      <w:r>
+        <w:rPr>
+          <w:rFonts w:eastAsia="Times New Roman"/>
+        </w:rPr>
+        <w:t xml:space="preserve">phù hợp. Có </w:t>
+      </w:r>
+      <w:r>
+        <w:t xml:space="preserve">2 bạn học </w:t>
+      </w:r>
+      <w:r>
+        <w:rPr>
+          <w:rFonts w:eastAsia="Times New Roman"/>
+        </w:rPr>
+        <w:t xml:space="preserve">sinh </w:t>
+      </w:r>
+      <w:r>
+        <w:t xml:space="preserve">đề xuất </w:t>
+      </w:r>
+      <w:r>
+        <w:rPr>
+          <w:rFonts w:eastAsia="Times New Roman"/>
+        </w:rPr>
+        <w:t xml:space="preserve">phương pháp như </w:t>
+      </w:r>
+      <w:r>
+        <w:t>sau:</w:t>
+      </w:r>
+    </w:p>
+    <w:p>
+      <w:r>
+        <w:t>Học sinh A: Mời các chuyên gia tài chính gán nhãn “tốt”, “bình thường” và “xấu” cho từng khách hàng trong một tập khách hàng được chọn. Máy tính học cách phân loại từ tập dữ liệu đã gán nhãn này để phân loại cho các khách hàng khác.</w:t>
+      </w:r>
+    </w:p>
+    <w:p>
+      <w:r>
+        <w:t>Học sinh B: Máy tính tự động phân cụm toàn bộ tập dữ liệu khách hàng thành 3 cụm. Sau đó các chuyên gia được mời để gán nhãn cho các cụm này là “tốt”, “bình thường” và “xấu”.</w:t>
+      </w:r>
+    </w:p>
+    <w:p>
+      <w:r>
+        <w:t xml:space="preserve">Một số bạn học </w:t>
+      </w:r>
+      <w:r>
+        <w:rPr>
+          <w:rFonts w:eastAsia="Times New Roman"/>
+        </w:rPr>
+        <w:t xml:space="preserve">sinh </w:t>
+      </w:r>
+      <w:r>
+        <w:t xml:space="preserve">có ý kiến </w:t>
+      </w:r>
+      <w:r>
+        <w:rPr>
+          <w:rFonts w:eastAsia="Times New Roman"/>
+        </w:rPr>
+        <w:t xml:space="preserve">như </w:t>
+      </w:r>
+      <w:r>
+        <w:t>sau:</w:t>
+      </w:r>
+      <w:r>
+        <w:t>}</w:t>
+      </w:r>
+    </w:p>
+    <w:p>
+      <w:pPr>
+        <w:pStyle w:val="Heading2"/>
+      </w:pPr>
+      <w:r>
+        <w:t>Phương pháp của bạn học sinh A là theo mô hình học máy có giám sát.</w:t>
+      </w:r>
+    </w:p>
+    <w:p>
+      <w:pPr>
+        <w:pStyle w:val="Heading2"/>
+      </w:pPr>
+      <w:r>
+        <w:t>Phương pháp của bạn học sinh B là theo mô hình học máy không giám sát.</w:t>
+      </w:r>
+    </w:p>
+    <w:p>
+      <w:pPr>
+        <w:pStyle w:val="Heading2"/>
+      </w:pPr>
+      <w:r>
+        <w:t>Phương pháp phân loại khách hàng của học sinh B tốt hơn của học sinh A.</w:t>
+      </w:r>
+    </w:p>
+    <w:p>
+      <w:pPr>
+        <w:pStyle w:val="Heading2"/>
+      </w:pPr>
+      <w:r>
+        <w:t>Phương pháp thu thập dữ liệu sinh trắc học khuôn mặt có thể giúp ngân hàng giải quyết bài toán phân loại khách hàng thành các nhóm đã nêu.</w:t>
+      </w:r>
+    </w:p>
+    <w:p>
+      <w:r>
+        <w:t>Đáp án:</w:t>
+      </w:r>
+      <w:r>
+        <w:t xml:space="preserve"> Đ Đ S S</w:t>
+      </w:r>
+    </w:p>
+    <w:p>
+      <w:pPr>
+        <w:pStyle w:val="Heading1"/>
+        <w:rPr>
+          <w:rFonts w:eastAsia="Times New Roman"/>
+        </w:rPr>
+      </w:pPr>
+      <w:r>
+        <w:rPr>
+          <w:rFonts w:eastAsia="Times New Roman"/>
+        </w:rPr>
+        <w:t>{</w:t>
+      </w:r>
+      <w:r>
+        <w:rPr>
+          <w:rFonts w:eastAsia="Times New Roman"/>
+        </w:rPr>
+        <w:t xml:space="preserve">Chọn </w:t>
+      </w:r>
+      <w:r>
+        <w:t xml:space="preserve">một trong hai ngôn </w:t>
+      </w:r>
+      <w:r>
+        <w:rPr>
+          <w:rFonts w:eastAsia="Times New Roman"/>
+        </w:rPr>
+        <w:t xml:space="preserve">ngữ </w:t>
+      </w:r>
+      <w:r>
+        <w:t xml:space="preserve">Python </w:t>
+      </w:r>
+      <w:r>
+        <w:rPr>
+          <w:rFonts w:eastAsia="Times New Roman"/>
+        </w:rPr>
+        <w:t xml:space="preserve">hoặc C++ để </w:t>
+      </w:r>
+      <w:r>
+        <w:t xml:space="preserve">tìm hiểu một </w:t>
+      </w:r>
+      <w:r>
+        <w:rPr>
+          <w:rFonts w:eastAsia="Times New Roman"/>
+        </w:rPr>
+        <w:t xml:space="preserve">hàm cho </w:t>
+      </w:r>
+      <w:r>
+        <w:t xml:space="preserve">dưới </w:t>
+      </w:r>
+      <w:r>
+        <w:rPr>
+          <w:rFonts w:eastAsia="Times New Roman"/>
+        </w:rPr>
+        <w:t>đây:</w:t>
+      </w:r>
+    </w:p>
+    <w:p>
+      <w:r>
+        <w:lastRenderedPageBreak/>
+        <w:t>------------</w:t>
+      </w:r>
+    </w:p>
+    <w:p>
+      <w:pPr>
+        <w:rPr>
           <w:i/>
           <w:iCs/>
         </w:rPr>
-        <w:t>, Sự kiện</w:t>
-      </w:r>
+      </w:pPr>
       <w:r>
         <w:rPr>
           <w:i/>
           <w:iCs/>
         </w:rPr>
-        <w:t xml:space="preserve">. </w:t>
-      </w:r>
-      <w:r>
-        <w:t xml:space="preserve">Bạn </w:t>
-      </w:r>
-      <w:r>
-        <w:rPr>
-          <w:rFonts w:eastAsia="Times New Roman"/>
-        </w:rPr>
-        <w:t xml:space="preserve">học </w:t>
-      </w:r>
-      <w:r>
-        <w:t xml:space="preserve">sinh đó </w:t>
-      </w:r>
-      <w:r>
-        <w:rPr>
-          <w:rFonts w:eastAsia="Times New Roman"/>
-        </w:rPr>
-        <w:t xml:space="preserve">có </w:t>
-      </w:r>
-      <w:r>
-        <w:t xml:space="preserve">một số nhận </w:t>
-      </w:r>
-      <w:r>
-        <w:rPr>
-          <w:rFonts w:eastAsia="Times New Roman"/>
-        </w:rPr>
-        <w:t xml:space="preserve">xét </w:t>
-      </w:r>
-      <w:r>
-        <w:t>sau đây:</w:t>
-      </w:r>
-      <w:r>
-        <w:t>}</w:t>
-      </w:r>
-    </w:p>
-    <w:p>
-      <w:pPr>
-        <w:pStyle w:val="Heading2"/>
-      </w:pPr>
-      <w:r>
-        <w:t xml:space="preserve">Có </w:t>
-      </w:r>
-      <w:r>
-        <w:rPr>
-          <w:rFonts w:eastAsia="Times New Roman"/>
-        </w:rPr>
-        <w:t xml:space="preserve">thể tạo 3 trang web đã </w:t>
-      </w:r>
-      <w:r>
-        <w:t>nêu từ các mẫu (theme</w:t>
-      </w:r>
-      <w:r>
-        <w:rPr>
-          <w:rFonts w:eastAsia="Times New Roman"/>
-        </w:rPr>
-        <w:t xml:space="preserve">) </w:t>
-      </w:r>
-      <w:r>
-        <w:t xml:space="preserve">có sẵn của phần mềm tạo </w:t>
-      </w:r>
-      <w:r>
-        <w:rPr>
-          <w:rFonts w:eastAsia="Times New Roman"/>
-        </w:rPr>
-        <w:t>trang web</w:t>
-      </w:r>
-      <w:r>
-        <w:t>.</w:t>
-      </w:r>
-    </w:p>
-    <w:p>
-      <w:pPr>
-        <w:pStyle w:val="Heading2"/>
-      </w:pPr>
-      <w:r>
-        <w:t>Tổ chức chia sẻ website bằng cách duy nhất là: gửi các tệp * html của trang web qua email.</w:t>
-      </w:r>
-    </w:p>
-    <w:p>
-      <w:pPr>
-        <w:pStyle w:val="Heading2"/>
-      </w:pPr>
-      <w:r>
-        <w:t xml:space="preserve">Trong trang </w:t>
-      </w:r>
-      <w:r>
-        <w:rPr>
-          <w:rFonts w:eastAsia="Times New Roman"/>
+        <w:t>Hàm viết bằng ngôn ngữ Python</w:t>
+      </w:r>
+    </w:p>
+    <w:p>
+      <w:r>
+        <w:t>def find(x, a, n):</w:t>
+      </w:r>
+    </w:p>
+    <w:p>
+      <w:pPr>
+        <w:rPr>
+          <w:rFonts w:eastAsia="Courier New"/>
+        </w:rPr>
+      </w:pPr>
+      <w:r>
+        <w:t xml:space="preserve">found </w:t>
+      </w:r>
+      <w:r>
+        <w:rPr>
+          <w:rFonts w:eastAsia="Times New Roman"/>
+        </w:rPr>
+        <w:t xml:space="preserve">= </w:t>
+      </w:r>
+      <w:r>
+        <w:rPr>
+          <w:rFonts w:eastAsia="Courier New"/>
+        </w:rPr>
+        <w:t>False</w:t>
+      </w:r>
+    </w:p>
+    <w:p>
+      <w:r>
+        <w:t>i = 0</w:t>
+      </w:r>
+    </w:p>
+    <w:p>
+      <w:r>
+        <w:t>while (i&lt;n) and not found:</w:t>
+      </w:r>
+    </w:p>
+    <w:p>
+      <w:r>
+        <w:t>if a[i] == X:</w:t>
+      </w:r>
+    </w:p>
+    <w:p>
+      <w:r>
+        <w:t xml:space="preserve">found </w:t>
+      </w:r>
+      <w:r>
+        <w:rPr>
+          <w:rFonts w:eastAsia="Courier New"/>
+        </w:rPr>
+        <w:t xml:space="preserve">= </w:t>
+      </w:r>
+      <w:r>
+        <w:t>True</w:t>
+      </w:r>
+    </w:p>
+    <w:p>
+      <w:pPr>
+        <w:rPr>
+          <w:rFonts w:eastAsia="Times New Roman"/>
+        </w:rPr>
+      </w:pPr>
+      <w:r>
+        <w:t xml:space="preserve">i = i </w:t>
+      </w:r>
+      <w:r>
+        <w:rPr>
+          <w:rFonts w:eastAsia="Times New Roman"/>
+        </w:rPr>
+        <w:t>+ 1</w:t>
+      </w:r>
+    </w:p>
+    <w:p>
+      <w:r>
+        <w:t>return found</w:t>
+      </w:r>
+    </w:p>
+    <w:p>
+      <w:r>
+        <w:t>------------</w:t>
+      </w:r>
+    </w:p>
+    <w:p>
+      <w:pPr>
+        <w:rPr>
           <w:i/>
           <w:iCs/>
         </w:rPr>
-        <w:t>Sự kiện</w:t>
-      </w:r>
+      </w:pPr>
       <w:r>
         <w:rPr>
           <w:i/>
           <w:iCs/>
         </w:rPr>
-        <w:t xml:space="preserve">, </w:t>
-      </w:r>
-      <w:r>
-        <w:t xml:space="preserve">để hiển thị nhiều hình ảnh </w:t>
-      </w:r>
-      <w:r>
-        <w:rPr>
-          <w:rFonts w:eastAsia="Times New Roman"/>
-        </w:rPr>
-        <w:t xml:space="preserve">trong cùng </w:t>
-      </w:r>
-      <w:r>
-        <w:t xml:space="preserve">một khối, </w:t>
+        <w:t>Hàm viết bằng ngôn ngữ C++</w:t>
+      </w:r>
+    </w:p>
+    <w:p>
+      <w:r>
+        <w:t xml:space="preserve">bool find(int x, int </w:t>
+      </w:r>
+      <w:r>
+        <w:rPr>
+          <w:rFonts w:eastAsia="Times New Roman"/>
+        </w:rPr>
+        <w:t>a</w:t>
+      </w:r>
+      <w:r>
+        <w:t>[], int n) {</w:t>
+      </w:r>
+    </w:p>
+    <w:p>
+      <w:pPr>
+        <w:rPr>
+          <w:rFonts w:eastAsia="Times New Roman"/>
+        </w:rPr>
+      </w:pPr>
+      <w:r>
+        <w:rPr>
+          <w:rFonts w:eastAsia="Courier New"/>
+        </w:rPr>
+        <w:t xml:space="preserve">bool </w:t>
+      </w:r>
+      <w:r>
+        <w:t xml:space="preserve">found </w:t>
+      </w:r>
+      <w:r>
+        <w:rPr>
+          <w:rFonts w:eastAsia="Times New Roman"/>
+        </w:rPr>
+        <w:t>=</w:t>
+      </w:r>
+    </w:p>
+    <w:p>
+      <w:r>
+        <w:t>false;</w:t>
+      </w:r>
+    </w:p>
+    <w:p>
+      <w:r>
+        <w:t>int i = 0;</w:t>
+      </w:r>
+    </w:p>
+    <w:p>
+      <w:r>
+        <w:t>while (i&lt;n &amp;&amp; ! found) {</w:t>
+      </w:r>
+    </w:p>
+    <w:p>
+      <w:r>
+        <w:t>if (a[i]</w:t>
+      </w:r>
+    </w:p>
+    <w:p>
+      <w:r>
+        <w:t>==</w:t>
+      </w:r>
+    </w:p>
+    <w:p>
+      <w:r>
+        <w:t>x)</w:t>
+      </w:r>
+    </w:p>
+    <w:p>
+      <w:r>
+        <w:t>i = i + 1; }</w:t>
+      </w:r>
+      <w:r>
+        <w:t>\</w:t>
+      </w:r>
+    </w:p>
+    <w:p>
+      <w:pPr>
+        <w:rPr>
+          <w:rFonts w:eastAsia="Courier New"/>
+        </w:rPr>
+      </w:pPr>
+      <w:r>
+        <w:t xml:space="preserve">found </w:t>
+      </w:r>
+      <w:r>
+        <w:rPr>
+          <w:rFonts w:eastAsia="Courier New"/>
+        </w:rPr>
+        <w:t xml:space="preserve">= </w:t>
+      </w:r>
+      <w:r>
+        <w:t>true</w:t>
+      </w:r>
+      <w:r>
+        <w:rPr>
+          <w:rFonts w:eastAsia="Courier New"/>
+        </w:rPr>
+        <w:t>;</w:t>
+      </w:r>
+    </w:p>
+    <w:p>
+      <w:pPr>
+        <w:rPr>
+          <w:rFonts w:eastAsia="Courier New"/>
+        </w:rPr>
+      </w:pPr>
+      <w:r>
+        <w:t xml:space="preserve">return found; </w:t>
+      </w:r>
+      <w:r>
+        <w:rPr>
+          <w:rFonts w:eastAsia="Courier New"/>
+        </w:rPr>
+        <w:t>}</w:t>
+      </w:r>
+      <w:r>
+        <w:rPr>
+          <w:rFonts w:eastAsia="Courier New"/>
+        </w:rPr>
+        <w:t>\</w:t>
+      </w:r>
+    </w:p>
+    <w:p>
+      <w:r>
+        <w:t>------------</w:t>
+      </w:r>
+    </w:p>
+    <w:p>
+      <w:r>
+        <w:t xml:space="preserve">Một số bạn học sinh nhận </w:t>
+      </w:r>
+      <w:r>
+        <w:rPr>
+          <w:rFonts w:eastAsia="Times New Roman"/>
+        </w:rPr>
+        <w:t xml:space="preserve">xét </w:t>
+      </w:r>
+      <w:r>
+        <w:t xml:space="preserve">về hàm trên </w:t>
+      </w:r>
+      <w:r>
+        <w:rPr>
+          <w:rFonts w:eastAsia="Times New Roman"/>
+        </w:rPr>
+        <w:t xml:space="preserve">như </w:t>
+      </w:r>
+      <w:r>
+        <w:t>sau:</w:t>
+      </w:r>
+      <w:r>
+        <w:t>}</w:t>
+      </w:r>
+    </w:p>
+    <w:p>
+      <w:pPr>
+        <w:pStyle w:val="Heading2"/>
+      </w:pPr>
+      <w:r>
+        <w:t xml:space="preserve">Hàm thể hiện một thuật </w:t>
+      </w:r>
+      <w:r>
+        <w:rPr>
+          <w:rFonts w:eastAsia="Times New Roman"/>
+        </w:rPr>
+        <w:t xml:space="preserve">toán </w:t>
+      </w:r>
+      <w:r>
+        <w:t>đệ quy.</w:t>
+      </w:r>
+    </w:p>
+    <w:p>
+      <w:pPr>
+        <w:pStyle w:val="Heading2"/>
+      </w:pPr>
+      <w:r>
+        <w:rPr>
+          <w:rFonts w:eastAsia="Times New Roman"/>
+        </w:rPr>
+        <w:t xml:space="preserve">Các </w:t>
+      </w:r>
+      <w:r>
+        <w:t xml:space="preserve">thao tác </w:t>
+      </w:r>
+      <w:r>
+        <w:rPr>
+          <w:rFonts w:eastAsia="Times New Roman"/>
+        </w:rPr>
+        <w:t xml:space="preserve">với </w:t>
+      </w:r>
+      <w:r>
+        <w:t xml:space="preserve">mảng </w:t>
+      </w:r>
+      <w:r>
+        <w:rPr>
+          <w:rFonts w:eastAsia="Times New Roman"/>
+        </w:rPr>
+        <w:t xml:space="preserve">a trong hàm </w:t>
+      </w:r>
+      <w:r>
+        <w:t xml:space="preserve">không phải là </w:t>
+      </w:r>
+      <w:r>
+        <w:rPr>
+          <w:rFonts w:eastAsia="Times New Roman"/>
+        </w:rPr>
+        <w:t xml:space="preserve">thao tác </w:t>
+      </w:r>
+      <w:r>
+        <w:t xml:space="preserve">trên kiểu dữ liệu </w:t>
+      </w:r>
+      <w:r>
+        <w:rPr>
+          <w:rFonts w:eastAsia="Times New Roman"/>
+        </w:rPr>
+        <w:t>ngăn xếp</w:t>
+      </w:r>
+      <w:r>
+        <w:t>.</w:t>
+      </w:r>
+    </w:p>
+    <w:p>
+      <w:pPr>
+        <w:pStyle w:val="Heading2"/>
+      </w:pPr>
+      <w:r>
+        <w:t xml:space="preserve">Hàm </w:t>
       </w:r>
       <w:r>
         <w:rPr>
@@ -4756,22 +4666,94 @@
         <w:t xml:space="preserve">có </w:t>
       </w:r>
       <w:r>
-        <w:t xml:space="preserve">thể sử </w:t>
-      </w:r>
-      <w:r>
-        <w:rPr>
-          <w:rFonts w:eastAsia="Times New Roman"/>
-        </w:rPr>
-        <w:t xml:space="preserve">dụng </w:t>
-      </w:r>
-      <w:r>
-        <w:t xml:space="preserve">chức </w:t>
-      </w:r>
-      <w:r>
-        <w:rPr>
-          <w:rFonts w:eastAsia="Times New Roman"/>
-        </w:rPr>
-        <w:t xml:space="preserve">năng </w:t>
+        <w:t xml:space="preserve">độ </w:t>
+      </w:r>
+      <w:r>
+        <w:rPr>
+          <w:rFonts w:eastAsia="Times New Roman"/>
+        </w:rPr>
+        <w:t xml:space="preserve">phức </w:t>
+      </w:r>
+      <w:r>
+        <w:t xml:space="preserve">tạp thuật toán </w:t>
+      </w:r>
+      <w:r>
+        <w:rPr>
+          <w:rFonts w:eastAsia="Times New Roman"/>
+        </w:rPr>
+        <w:t>là O(n</w:t>
+      </w:r>
+      <w:r>
+        <w:t>).</w:t>
+      </w:r>
+    </w:p>
+    <w:p>
+      <w:pPr>
+        <w:pStyle w:val="Heading2"/>
+      </w:pPr>
+      <w:r>
+        <w:t>Nếu mảng a =</w:t>
+      </w:r>
+      <w:r>
+        <w:t xml:space="preserve"> </w:t>
+      </w:r>
+      <w:r>
+        <w:t>{2, 6, 3, 8} và x = 9 thì hàm trả về giá trị logic sai.</w:t>
+      </w:r>
+    </w:p>
+    <w:p>
+      <w:r>
+        <w:t>Đáp án:</w:t>
+      </w:r>
+      <w:r>
+        <w:t xml:space="preserve"> S Đ S Đ</w:t>
+      </w:r>
+    </w:p>
+    <w:p>
+      <w:pPr>
+        <w:pStyle w:val="Heading1"/>
+      </w:pPr>
+      <w:r>
+        <w:t>{</w:t>
+      </w:r>
+      <w:r>
+        <w:t xml:space="preserve">Một </w:t>
+      </w:r>
+      <w:r>
+        <w:rPr>
+          <w:rFonts w:eastAsia="Times New Roman"/>
+        </w:rPr>
+        <w:t xml:space="preserve">học </w:t>
+      </w:r>
+      <w:r>
+        <w:t xml:space="preserve">sinh </w:t>
+      </w:r>
+      <w:r>
+        <w:rPr>
+          <w:rFonts w:eastAsia="Times New Roman"/>
+        </w:rPr>
+        <w:t xml:space="preserve">thực </w:t>
+      </w:r>
+      <w:r>
+        <w:t xml:space="preserve">hiện tạo </w:t>
+      </w:r>
+      <w:r>
+        <w:rPr>
+          <w:rFonts w:eastAsia="Times New Roman"/>
+        </w:rPr>
+        <w:t xml:space="preserve">website </w:t>
+      </w:r>
+      <w:r>
+        <w:t xml:space="preserve">cho một tổ chức từ thiện gồm 3 </w:t>
+      </w:r>
+      <w:r>
+        <w:rPr>
+          <w:rFonts w:eastAsia="Times New Roman"/>
+        </w:rPr>
+        <w:t xml:space="preserve">trang web </w:t>
+      </w:r>
+      <w:r>
+        <w:t xml:space="preserve">sau: </w:t>
       </w:r>
       <w:r>
         <w:rPr>
@@ -4779,127 +4761,10 @@
           <w:i/>
           <w:iCs/>
         </w:rPr>
-        <w:t xml:space="preserve">Bộ sưu tập </w:t>
-      </w:r>
-      <w:r>
-        <w:rPr>
-          <w:rFonts w:eastAsia="Times New Roman"/>
-        </w:rPr>
-        <w:t>(</w:t>
-      </w:r>
-      <w:r>
-        <w:t xml:space="preserve">hoặc </w:t>
-      </w:r>
-      <w:r>
-        <w:rPr>
-          <w:rFonts w:eastAsia="Times New Roman"/>
-        </w:rPr>
-        <w:t xml:space="preserve">thanh </w:t>
-      </w:r>
-      <w:r>
-        <w:t>trượt</w:t>
-      </w:r>
-      <w:r>
-        <w:rPr>
-          <w:rFonts w:eastAsia="Times New Roman"/>
-        </w:rPr>
-        <w:t xml:space="preserve">/băng </w:t>
-      </w:r>
-      <w:r>
-        <w:t xml:space="preserve">chuyền hình </w:t>
-      </w:r>
-      <w:r>
-        <w:rPr>
-          <w:rFonts w:eastAsia="Times New Roman"/>
-        </w:rPr>
-        <w:t xml:space="preserve">ảnh) của </w:t>
-      </w:r>
-      <w:r>
-        <w:t xml:space="preserve">phần mềm </w:t>
-      </w:r>
-      <w:r>
-        <w:rPr>
-          <w:rFonts w:eastAsia="Times New Roman"/>
-        </w:rPr>
-        <w:t>tạo trang web</w:t>
-      </w:r>
-      <w:r>
-        <w:t>.</w:t>
-      </w:r>
-    </w:p>
-    <w:p>
-      <w:pPr>
-        <w:pStyle w:val="Heading2"/>
-      </w:pPr>
-      <w:r>
-        <w:t xml:space="preserve">Khi cần đăng </w:t>
-      </w:r>
-      <w:r>
-        <w:rPr>
-          <w:rFonts w:eastAsia="Times New Roman"/>
-        </w:rPr>
-        <w:t xml:space="preserve">lại </w:t>
-      </w:r>
-      <w:r>
-        <w:t xml:space="preserve">một </w:t>
-      </w:r>
-      <w:r>
-        <w:rPr>
-          <w:rFonts w:eastAsia="Times New Roman"/>
-        </w:rPr>
-        <w:t xml:space="preserve">video </w:t>
-      </w:r>
-      <w:r>
-        <w:t xml:space="preserve">về hoạt động từ thiện trên </w:t>
-      </w:r>
-      <w:r>
-        <w:rPr>
-          <w:rFonts w:eastAsia="Times New Roman"/>
-        </w:rPr>
-        <w:t>YouTube</w:t>
+        <w:t>Giới thiệu về tổ chức</w:t>
       </w:r>
       <w:r>
         <w:t xml:space="preserve">, </w:t>
-      </w:r>
-      <w:r>
-        <w:rPr>
-          <w:rFonts w:eastAsia="Times New Roman"/>
-        </w:rPr>
-        <w:t xml:space="preserve">cách </w:t>
-      </w:r>
-      <w:r>
-        <w:t xml:space="preserve">làm tốt </w:t>
-      </w:r>
-      <w:r>
-        <w:lastRenderedPageBreak/>
-        <w:t xml:space="preserve">nhất là </w:t>
-      </w:r>
-      <w:r>
-        <w:rPr>
-          <w:rFonts w:eastAsia="Times New Roman"/>
-        </w:rPr>
-        <w:t xml:space="preserve">tải video </w:t>
-      </w:r>
-      <w:r>
-        <w:t xml:space="preserve">đó về máy tính, sau đó </w:t>
-      </w:r>
-      <w:r>
-        <w:rPr>
-          <w:rFonts w:eastAsia="Times New Roman"/>
-        </w:rPr>
-        <w:t xml:space="preserve">chèn video </w:t>
-      </w:r>
-      <w:r>
-        <w:t xml:space="preserve">vào </w:t>
-      </w:r>
-      <w:r>
-        <w:rPr>
-          <w:rFonts w:eastAsia="Times New Roman"/>
-        </w:rPr>
-        <w:t xml:space="preserve">trang web bằng </w:t>
-      </w:r>
-      <w:r>
-        <w:t xml:space="preserve">chức năng </w:t>
       </w:r>
       <w:r>
         <w:rPr>
@@ -4907,6 +4772,296 @@
           <w:i/>
           <w:iCs/>
         </w:rPr>
+        <w:t xml:space="preserve">Thông tin dự </w:t>
+      </w:r>
+      <w:r>
+        <w:rPr>
+          <w:i/>
+          <w:iCs/>
+        </w:rPr>
+        <w:t>án</w:t>
+      </w:r>
+      <w:r>
+        <w:rPr>
+          <w:rFonts w:eastAsia="Times New Roman"/>
+          <w:i/>
+          <w:iCs/>
+        </w:rPr>
+        <w:t>, Sự kiện</w:t>
+      </w:r>
+      <w:r>
+        <w:rPr>
+          <w:i/>
+          <w:iCs/>
+        </w:rPr>
+        <w:t xml:space="preserve">. </w:t>
+      </w:r>
+      <w:r>
+        <w:t xml:space="preserve">Bạn </w:t>
+      </w:r>
+      <w:r>
+        <w:rPr>
+          <w:rFonts w:eastAsia="Times New Roman"/>
+        </w:rPr>
+        <w:t xml:space="preserve">học </w:t>
+      </w:r>
+      <w:r>
+        <w:t xml:space="preserve">sinh đó </w:t>
+      </w:r>
+      <w:r>
+        <w:rPr>
+          <w:rFonts w:eastAsia="Times New Roman"/>
+        </w:rPr>
+        <w:t xml:space="preserve">có </w:t>
+      </w:r>
+      <w:r>
+        <w:t xml:space="preserve">một số nhận </w:t>
+      </w:r>
+      <w:r>
+        <w:rPr>
+          <w:rFonts w:eastAsia="Times New Roman"/>
+        </w:rPr>
+        <w:t xml:space="preserve">xét </w:t>
+      </w:r>
+      <w:r>
+        <w:t>sau đây:</w:t>
+      </w:r>
+      <w:r>
+        <w:t>}</w:t>
+      </w:r>
+    </w:p>
+    <w:p>
+      <w:pPr>
+        <w:pStyle w:val="Heading2"/>
+      </w:pPr>
+      <w:r>
+        <w:t xml:space="preserve">Có </w:t>
+      </w:r>
+      <w:r>
+        <w:rPr>
+          <w:rFonts w:eastAsia="Times New Roman"/>
+        </w:rPr>
+        <w:t xml:space="preserve">thể tạo 3 trang web đã </w:t>
+      </w:r>
+      <w:r>
+        <w:t>nêu từ các mẫu (theme</w:t>
+      </w:r>
+      <w:r>
+        <w:rPr>
+          <w:rFonts w:eastAsia="Times New Roman"/>
+        </w:rPr>
+        <w:t xml:space="preserve">) </w:t>
+      </w:r>
+      <w:r>
+        <w:t xml:space="preserve">có sẵn của phần mềm tạo </w:t>
+      </w:r>
+      <w:r>
+        <w:rPr>
+          <w:rFonts w:eastAsia="Times New Roman"/>
+        </w:rPr>
+        <w:t>trang web</w:t>
+      </w:r>
+      <w:r>
+        <w:t>.</w:t>
+      </w:r>
+    </w:p>
+    <w:p>
+      <w:pPr>
+        <w:pStyle w:val="Heading2"/>
+      </w:pPr>
+      <w:r>
+        <w:lastRenderedPageBreak/>
+        <w:t>Tổ chức chia sẻ website bằng cách duy nhất là: gửi các tệp * html của trang web qua email.</w:t>
+      </w:r>
+    </w:p>
+    <w:p>
+      <w:pPr>
+        <w:pStyle w:val="Heading2"/>
+      </w:pPr>
+      <w:r>
+        <w:t xml:space="preserve">Trong trang </w:t>
+      </w:r>
+      <w:r>
+        <w:rPr>
+          <w:rFonts w:eastAsia="Times New Roman"/>
+          <w:i/>
+          <w:iCs/>
+        </w:rPr>
+        <w:t>Sự kiện</w:t>
+      </w:r>
+      <w:r>
+        <w:rPr>
+          <w:i/>
+          <w:iCs/>
+        </w:rPr>
+        <w:t xml:space="preserve">, </w:t>
+      </w:r>
+      <w:r>
+        <w:t xml:space="preserve">để hiển thị nhiều hình ảnh </w:t>
+      </w:r>
+      <w:r>
+        <w:rPr>
+          <w:rFonts w:eastAsia="Times New Roman"/>
+        </w:rPr>
+        <w:t xml:space="preserve">trong cùng </w:t>
+      </w:r>
+      <w:r>
+        <w:t xml:space="preserve">một khối, </w:t>
+      </w:r>
+      <w:r>
+        <w:rPr>
+          <w:rFonts w:eastAsia="Times New Roman"/>
+        </w:rPr>
+        <w:t xml:space="preserve">có </w:t>
+      </w:r>
+      <w:r>
+        <w:t xml:space="preserve">thể sử </w:t>
+      </w:r>
+      <w:r>
+        <w:rPr>
+          <w:rFonts w:eastAsia="Times New Roman"/>
+        </w:rPr>
+        <w:t xml:space="preserve">dụng </w:t>
+      </w:r>
+      <w:r>
+        <w:t xml:space="preserve">chức </w:t>
+      </w:r>
+      <w:r>
+        <w:rPr>
+          <w:rFonts w:eastAsia="Times New Roman"/>
+        </w:rPr>
+        <w:t xml:space="preserve">năng </w:t>
+      </w:r>
+      <w:r>
+        <w:rPr>
+          <w:rFonts w:eastAsia="Times New Roman"/>
+          <w:i/>
+          <w:iCs/>
+        </w:rPr>
+        <w:t xml:space="preserve">Bộ sưu tập </w:t>
+      </w:r>
+      <w:r>
+        <w:rPr>
+          <w:rFonts w:eastAsia="Times New Roman"/>
+        </w:rPr>
+        <w:t>(</w:t>
+      </w:r>
+      <w:r>
+        <w:t xml:space="preserve">hoặc </w:t>
+      </w:r>
+      <w:r>
+        <w:rPr>
+          <w:rFonts w:eastAsia="Times New Roman"/>
+        </w:rPr>
+        <w:t xml:space="preserve">thanh </w:t>
+      </w:r>
+      <w:r>
+        <w:t>trượt</w:t>
+      </w:r>
+      <w:r>
+        <w:rPr>
+          <w:rFonts w:eastAsia="Times New Roman"/>
+        </w:rPr>
+        <w:t xml:space="preserve">/băng </w:t>
+      </w:r>
+      <w:r>
+        <w:t xml:space="preserve">chuyền hình </w:t>
+      </w:r>
+      <w:r>
+        <w:rPr>
+          <w:rFonts w:eastAsia="Times New Roman"/>
+        </w:rPr>
+        <w:t xml:space="preserve">ảnh) của </w:t>
+      </w:r>
+      <w:r>
+        <w:t xml:space="preserve">phần mềm </w:t>
+      </w:r>
+      <w:r>
+        <w:rPr>
+          <w:rFonts w:eastAsia="Times New Roman"/>
+        </w:rPr>
+        <w:t>tạo trang web</w:t>
+      </w:r>
+      <w:r>
+        <w:t>.</w:t>
+      </w:r>
+    </w:p>
+    <w:p>
+      <w:pPr>
+        <w:pStyle w:val="Heading2"/>
+      </w:pPr>
+      <w:r>
+        <w:t xml:space="preserve">Khi cần đăng </w:t>
+      </w:r>
+      <w:r>
+        <w:rPr>
+          <w:rFonts w:eastAsia="Times New Roman"/>
+        </w:rPr>
+        <w:t xml:space="preserve">lại </w:t>
+      </w:r>
+      <w:r>
+        <w:t xml:space="preserve">một </w:t>
+      </w:r>
+      <w:r>
+        <w:rPr>
+          <w:rFonts w:eastAsia="Times New Roman"/>
+        </w:rPr>
+        <w:t xml:space="preserve">video </w:t>
+      </w:r>
+      <w:r>
+        <w:t xml:space="preserve">về hoạt động từ thiện trên </w:t>
+      </w:r>
+      <w:r>
+        <w:rPr>
+          <w:rFonts w:eastAsia="Times New Roman"/>
+        </w:rPr>
+        <w:t>YouTube</w:t>
+      </w:r>
+      <w:r>
+        <w:t xml:space="preserve">, </w:t>
+      </w:r>
+      <w:r>
+        <w:rPr>
+          <w:rFonts w:eastAsia="Times New Roman"/>
+        </w:rPr>
+        <w:t xml:space="preserve">cách </w:t>
+      </w:r>
+      <w:r>
+        <w:t xml:space="preserve">làm tốt nhất là </w:t>
+      </w:r>
+      <w:r>
+        <w:rPr>
+          <w:rFonts w:eastAsia="Times New Roman"/>
+        </w:rPr>
+        <w:t xml:space="preserve">tải video </w:t>
+      </w:r>
+      <w:r>
+        <w:t xml:space="preserve">đó về máy tính, sau đó </w:t>
+      </w:r>
+      <w:r>
+        <w:rPr>
+          <w:rFonts w:eastAsia="Times New Roman"/>
+        </w:rPr>
+        <w:t xml:space="preserve">chèn video </w:t>
+      </w:r>
+      <w:r>
+        <w:t xml:space="preserve">vào </w:t>
+      </w:r>
+      <w:r>
+        <w:rPr>
+          <w:rFonts w:eastAsia="Times New Roman"/>
+        </w:rPr>
+        <w:t xml:space="preserve">trang web bằng </w:t>
+      </w:r>
+      <w:r>
+        <w:t xml:space="preserve">chức năng </w:t>
+      </w:r>
+      <w:r>
+        <w:rPr>
+          <w:rFonts w:eastAsia="Times New Roman"/>
+          <w:i/>
+          <w:iCs/>
+        </w:rPr>
         <w:t xml:space="preserve">Thêm hình ảnh/video </w:t>
       </w:r>
       <w:r>
@@ -4985,12 +5140,38 @@
     </w:p>
     <w:p>
       <w:r>
-        <w:t>BENHNHAN (MaBN, TenBN, DiaChi) lưu thông tin: mã bệnh nhân, tên bệnh nhân và địa chỉ của bệnh nhân.</w:t>
-      </w:r>
-    </w:p>
-    <w:p>
-      <w:r>
-        <w:t>HOADON (MaHD, MaBN, NgayBan) lưu thông tin: mã hóa đơn, mã bệnh nhân và ngày bán. THUOCBAN (MaHD, TenThuoc, SoLuong, DonGia, ThanhTien) lưu thông tin: mã hóa đơn, tên thuốc, số lượng, đơn giá và thành tiền.</w:t>
+        <w:rPr>
+          <w:i/>
+          <w:iCs/>
+        </w:rPr>
+        <w:t>BENHNHAN (MaBN, TenBN, DiaChi)</w:t>
+      </w:r>
+      <w:r>
+        <w:t xml:space="preserve"> lưu thông tin: mã bệnh nhân, tên bệnh nhân và địa chỉ của bệnh nhân.</w:t>
+      </w:r>
+    </w:p>
+    <w:p>
+      <w:r>
+        <w:rPr>
+          <w:i/>
+          <w:iCs/>
+        </w:rPr>
+        <w:t>HOADON (MaHD, MaBN, NgayBan)</w:t>
+      </w:r>
+      <w:r>
+        <w:t xml:space="preserve"> lưu thông tin: mã hóa đơn, mã bệnh nhân và ngày bán.</w:t>
+      </w:r>
+    </w:p>
+    <w:p>
+      <w:r>
+        <w:rPr>
+          <w:i/>
+          <w:iCs/>
+        </w:rPr>
+        <w:t>THUOCBAN (MaHD, TenThuoc, SoLuong, DonGia, ThanhTien)</w:t>
+      </w:r>
+      <w:r>
+        <w:t xml:space="preserve"> lưu thông tin: mã hóa đơn, tên thuốc, số lượng, đơn giá và thành tiền.</w:t>
       </w:r>
     </w:p>
     <w:p>

</xml_diff>

<commit_message>
- Minor bug fixed: Sample quiz deletes plain text option A, B, C, D.
- Minor bug fixed: GUI text resource deletes annoying new line.
</commit_message>
<xml_diff>
--- a/samples/09-Tinhoc.docx
+++ b/samples/09-Tinhoc.docx
@@ -1415,15 +1415,15 @@
         <w:pStyle w:val="Heading2"/>
       </w:pPr>
       <w:r>
-        <w:t>A.&lt;link href="tentep.css" rel="stylesheet"&gt;</w:t>
-      </w:r>
-    </w:p>
-    <w:p>
-      <w:pPr>
-        <w:pStyle w:val="Heading2"/>
-      </w:pPr>
-      <w:r>
-        <w:t>B.&lt;style link="</w:t>
+        <w:t>&lt;link href="tentep.css" rel="stylesheet"&gt;</w:t>
+      </w:r>
+    </w:p>
+    <w:p>
+      <w:pPr>
+        <w:pStyle w:val="Heading2"/>
+      </w:pPr>
+      <w:r>
+        <w:t>&lt;style link="</w:t>
       </w:r>
       <w:r>
         <w:rPr>
@@ -1440,12 +1440,6 @@
         <w:pStyle w:val="Heading2"/>
       </w:pPr>
       <w:r>
-        <w:rPr>
-          <w:rFonts w:eastAsia="Times New Roman"/>
-        </w:rPr>
-        <w:t>C.</w:t>
-      </w:r>
-      <w:r>
         <w:t>&lt;css link="tentep.css" rel="stylesheet"&gt;</w:t>
       </w:r>
     </w:p>
@@ -1454,7 +1448,7 @@
         <w:pStyle w:val="Heading2"/>
       </w:pPr>
       <w:r>
-        <w:t>D.&lt;link src="tentep.css" rel="stylesheet"&gt;</w:t>
+        <w:t>&lt;link src="tentep.css" rel="stylesheet"&gt;</w:t>
       </w:r>
     </w:p>
     <w:p>
@@ -1516,12 +1510,6 @@
         <w:pStyle w:val="Heading2"/>
       </w:pPr>
       <w:r>
-        <w:rPr>
-          <w:rFonts w:eastAsia="Times New Roman"/>
-        </w:rPr>
-        <w:t>A.</w:t>
-      </w:r>
-      <w:r>
         <w:t>&lt;a href="https://www.chinhphu.vn"&gt;Chính phủ&lt;/a&gt;</w:t>
       </w:r>
     </w:p>
@@ -1530,12 +1518,6 @@
         <w:pStyle w:val="Heading2"/>
       </w:pPr>
       <w:r>
-        <w:rPr>
-          <w:rFonts w:eastAsia="Times New Roman"/>
-        </w:rPr>
-        <w:t>B.</w:t>
-      </w:r>
-      <w:r>
         <w:t>&lt;a</w:t>
       </w:r>
       <w:r>
@@ -1559,12 +1541,6 @@
         <w:pStyle w:val="Heading2"/>
       </w:pPr>
       <w:r>
-        <w:rPr>
-          <w:rFonts w:eastAsia="Times New Roman"/>
-        </w:rPr>
-        <w:t>C.</w:t>
-      </w:r>
-      <w:r>
         <w:t>&lt;</w:t>
       </w:r>
       <w:r>
@@ -1590,9 +1566,6 @@
       <w:pPr>
         <w:pStyle w:val="Heading2"/>
       </w:pPr>
-      <w:r>
-        <w:t>D.</w:t>
-      </w:r>
       <w:r>
         <w:t>&lt;</w:t>
       </w:r>
@@ -2430,10 +2403,7 @@
     </w:p>
     <w:p>
       <w:r>
-        <w:t>----</w:t>
-      </w:r>
-      <w:r>
-        <w:t>--------</w:t>
+        <w:t>------------</w:t>
       </w:r>
     </w:p>
     <w:p>
@@ -4375,7 +4345,13 @@
     </w:p>
     <w:p>
       <w:r>
-        <w:t>if a[i] == X:</w:t>
+        <w:t xml:space="preserve">if a[i] == </w:t>
+      </w:r>
+      <w:r>
+        <w:t>x</w:t>
+      </w:r>
+      <w:r>
+        <w:t>:</w:t>
       </w:r>
     </w:p>
     <w:p>
@@ -4448,11 +4424,6 @@
       </w:r>
     </w:p>
     <w:p>
-      <w:pPr>
-        <w:rPr>
-          <w:rFonts w:eastAsia="Times New Roman"/>
-        </w:rPr>
-      </w:pPr>
       <w:r>
         <w:rPr>
           <w:rFonts w:eastAsia="Courier New"/>
@@ -4468,8 +4439,12 @@
         </w:rPr>
         <w:t>=</w:t>
       </w:r>
-    </w:p>
-    <w:p>
+      <w:r>
+        <w:rPr>
+          <w:rFonts w:eastAsia="Times New Roman"/>
+        </w:rPr>
+        <w:t xml:space="preserve"> </w:t>
+      </w:r>
       <w:r>
         <w:t>false;</w:t>
       </w:r>
@@ -4488,13 +4463,15 @@
       <w:r>
         <w:t>if (a[i]</w:t>
       </w:r>
-    </w:p>
-    <w:p>
+      <w:r>
+        <w:t xml:space="preserve"> </w:t>
+      </w:r>
       <w:r>
         <w:t>==</w:t>
       </w:r>
-    </w:p>
-    <w:p>
+      <w:r>
+        <w:t xml:space="preserve"> </w:t>
+      </w:r>
       <w:r>
         <w:t>x)</w:t>
       </w:r>
@@ -4870,7 +4847,6 @@
         <w:pStyle w:val="Heading2"/>
       </w:pPr>
       <w:r>
-        <w:lastRenderedPageBreak/>
         <w:t>Tổ chức chia sẻ website bằng cách duy nhất là: gửi các tệp * html của trang web qua email.</w:t>
       </w:r>
     </w:p>
@@ -4921,6 +4897,7 @@
         <w:rPr>
           <w:rFonts w:eastAsia="Times New Roman"/>
         </w:rPr>
+        <w:lastRenderedPageBreak/>
         <w:t xml:space="preserve">dụng </w:t>
       </w:r>
       <w:r>

</xml_diff>